<commit_message>
ATIVIDADE DE FUNCOES, PARAMETROS E TIPOS
</commit_message>
<xml_diff>
--- a/ALGORITMO E LÓGICA DE PROGRAMAÇÃO/AULA 13 _ 26-05-2026 - FUNCTIONS/ATIVIDADE AVALIATIVA.docx
+++ b/ALGORITMO E LÓGICA DE PROGRAMAÇÃO/AULA 13 _ 26-05-2026 - FUNCTIONS/ATIVIDADE AVALIATIVA.docx
@@ -137,7 +137,7 @@
           </mc:Choice>
           <mc:Fallback>
             <w:pict>
-              <v:shape w14:anchorId="76D52EFD" id="Graphic 1" o:spid="_x0000_s1026" style="position:absolute;margin-left:61.6pt;margin-top:20.75pt;width:472.3pt;height:1pt;z-index:-15728640;visibility:visible;mso-wrap-style:square;mso-wrap-distance-left:0;mso-wrap-distance-top:0;mso-wrap-distance-right:0;mso-wrap-distance-bottom:0;mso-position-horizontal:absolute;mso-position-horizontal-relative:page;mso-position-vertical:absolute;mso-position-vertical-relative:text;v-text-anchor:top" coordsize="5998210,12700" o:gfxdata="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" path="m5997829,l,,,12192r5997829,l5997829,xe" fillcolor="#1a5ea8" stroked="f">
+              <v:shape w14:anchorId="32F4FD58" id="Graphic 1" o:spid="_x0000_s1026" style="position:absolute;margin-left:61.6pt;margin-top:20.75pt;width:472.3pt;height:1pt;z-index:-15728640;visibility:visible;mso-wrap-style:square;mso-wrap-distance-left:0;mso-wrap-distance-top:0;mso-wrap-distance-right:0;mso-wrap-distance-bottom:0;mso-position-horizontal:absolute;mso-position-horizontal-relative:page;mso-position-vertical:absolute;mso-position-vertical-relative:text;v-text-anchor:top" coordsize="5998210,12700" o:gfxdata="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" path="m5997829,l,,,12192r5997829,l5997829,xe" fillcolor="#1a5ea8" stroked="f">
                 <v:path arrowok="t"/>
                 <w10:wrap type="topAndBottom" anchorx="page"/>
               </v:shape>
@@ -465,7 +465,7 @@
           </mc:Choice>
           <mc:Fallback>
             <w:pict>
-              <v:shape w14:anchorId="19030E2C" id="Graphic 2" o:spid="_x0000_s1026" style="position:absolute;margin-left:61.6pt;margin-top:20.65pt;width:472.3pt;height:.5pt;z-index:-15728128;visibility:visible;mso-wrap-style:square;mso-wrap-distance-left:0;mso-wrap-distance-top:0;mso-wrap-distance-right:0;mso-wrap-distance-bottom:0;mso-position-horizontal:absolute;mso-position-horizontal-relative:page;mso-position-vertical:absolute;mso-position-vertical-relative:text;v-text-anchor:top" coordsize="5998210,6350" o:gfxdata="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" path="m5997829,l,,,6096r5997829,l5997829,xe" fillcolor="#ddd" stroked="f">
+              <v:shape w14:anchorId="61BB5A6F" id="Graphic 2" o:spid="_x0000_s1026" style="position:absolute;margin-left:61.6pt;margin-top:20.65pt;width:472.3pt;height:.5pt;z-index:-15728128;visibility:visible;mso-wrap-style:square;mso-wrap-distance-left:0;mso-wrap-distance-top:0;mso-wrap-distance-right:0;mso-wrap-distance-bottom:0;mso-position-horizontal:absolute;mso-position-horizontal-relative:page;mso-position-vertical:absolute;mso-position-vertical-relative:text;v-text-anchor:top" coordsize="5998210,6350" o:gfxdata="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" path="m5997829,l,,,6096r5997829,l5997829,xe" fillcolor="#ddd" stroked="f">
                 <v:path arrowok="t"/>
                 <w10:wrap type="topAndBottom" anchorx="page"/>
               </v:shape>
@@ -1694,7 +1694,7 @@
           </mc:Choice>
           <mc:Fallback>
             <w:pict>
-              <v:shape w14:anchorId="4744A61B" id="Graphic 3" o:spid="_x0000_s1026" style="position:absolute;margin-left:61.6pt;margin-top:16.75pt;width:472.3pt;height:.5pt;z-index:-15727616;visibility:visible;mso-wrap-style:square;mso-wrap-distance-left:0;mso-wrap-distance-top:0;mso-wrap-distance-right:0;mso-wrap-distance-bottom:0;mso-position-horizontal:absolute;mso-position-horizontal-relative:page;mso-position-vertical:absolute;mso-position-vertical-relative:text;v-text-anchor:top" coordsize="5998210,6350" o:gfxdata="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" path="m5997829,l,,,6095r5997829,l5997829,xe" fillcolor="#ccc" stroked="f">
+              <v:shape w14:anchorId="41B87588" id="Graphic 3" o:spid="_x0000_s1026" style="position:absolute;margin-left:61.6pt;margin-top:16.75pt;width:472.3pt;height:.5pt;z-index:-15727616;visibility:visible;mso-wrap-style:square;mso-wrap-distance-left:0;mso-wrap-distance-top:0;mso-wrap-distance-right:0;mso-wrap-distance-bottom:0;mso-position-horizontal:absolute;mso-position-horizontal-relative:page;mso-position-vertical:absolute;mso-position-vertical-relative:text;v-text-anchor:top" coordsize="5998210,6350" o:gfxdata="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" path="m5997829,l,,,6095r5997829,l5997829,xe" fillcolor="#ccc" stroked="f">
                 <v:path arrowok="t"/>
                 <w10:wrap type="topAndBottom" anchorx="page"/>
               </v:shape>
@@ -6150,6 +6150,1342 @@
         <w:tabs>
           <w:tab w:val="left" w:pos="385"/>
         </w:tabs>
+        <w:ind w:left="385"/>
+        <w:rPr>
+          <w:b/>
+          <w:bCs/>
+          <w:color w:val="000000" w:themeColor="text1"/>
+          <w:spacing w:val="-2"/>
+          <w:sz w:val="26"/>
+          <w:szCs w:val="26"/>
+          <w:lang w:val="pt-BR"/>
+        </w:rPr>
+      </w:pPr>
+      <w:r>
+        <w:rPr>
+          <w:b/>
+          <w:bCs/>
+          <w:color w:val="000000" w:themeColor="text1"/>
+          <w:spacing w:val="-2"/>
+          <w:sz w:val="26"/>
+          <w:szCs w:val="26"/>
+          <w:lang w:val="pt-BR"/>
+        </w:rPr>
+        <w:tab/>
+      </w:r>
+      <w:r>
+        <w:rPr>
+          <w:b/>
+          <w:bCs/>
+          <w:color w:val="000000" w:themeColor="text1"/>
+          <w:spacing w:val="-2"/>
+          <w:sz w:val="26"/>
+          <w:szCs w:val="26"/>
+          <w:lang w:val="pt-BR"/>
+        </w:rPr>
+        <w:tab/>
+      </w:r>
+      <w:proofErr w:type="spellStart"/>
+      <w:r>
+        <w:rPr>
+          <w:b/>
+          <w:bCs/>
+          <w:color w:val="000000" w:themeColor="text1"/>
+          <w:spacing w:val="-2"/>
+          <w:sz w:val="26"/>
+          <w:szCs w:val="26"/>
+          <w:lang w:val="pt-BR"/>
+        </w:rPr>
+        <w:t>int</w:t>
+      </w:r>
+      <w:proofErr w:type="spellEnd"/>
+      <w:r>
+        <w:rPr>
+          <w:b/>
+          <w:bCs/>
+          <w:color w:val="000000" w:themeColor="text1"/>
+          <w:spacing w:val="-2"/>
+          <w:sz w:val="26"/>
+          <w:szCs w:val="26"/>
+          <w:lang w:val="pt-BR"/>
+        </w:rPr>
+        <w:t xml:space="preserve"> </w:t>
+      </w:r>
+      <w:proofErr w:type="spellStart"/>
+      <w:proofErr w:type="gramStart"/>
+      <w:r>
+        <w:rPr>
+          <w:b/>
+          <w:bCs/>
+          <w:color w:val="000000" w:themeColor="text1"/>
+          <w:spacing w:val="-2"/>
+          <w:sz w:val="26"/>
+          <w:szCs w:val="26"/>
+          <w:lang w:val="pt-BR"/>
+        </w:rPr>
+        <w:t>main</w:t>
+      </w:r>
+      <w:proofErr w:type="spellEnd"/>
+      <w:r>
+        <w:rPr>
+          <w:b/>
+          <w:bCs/>
+          <w:color w:val="000000" w:themeColor="text1"/>
+          <w:spacing w:val="-2"/>
+          <w:sz w:val="26"/>
+          <w:szCs w:val="26"/>
+          <w:lang w:val="pt-BR"/>
+        </w:rPr>
+        <w:t>( )</w:t>
+      </w:r>
+      <w:proofErr w:type="gramEnd"/>
+    </w:p>
+    <w:p>
+      <w:pPr>
+        <w:pStyle w:val="PargrafodaLista"/>
+        <w:tabs>
+          <w:tab w:val="left" w:pos="385"/>
+        </w:tabs>
+        <w:ind w:left="385"/>
+        <w:rPr>
+          <w:b/>
+          <w:bCs/>
+          <w:color w:val="000000" w:themeColor="text1"/>
+          <w:spacing w:val="-2"/>
+          <w:sz w:val="26"/>
+          <w:szCs w:val="26"/>
+          <w:lang w:val="pt-BR"/>
+        </w:rPr>
+      </w:pPr>
+      <w:r>
+        <w:rPr>
+          <w:b/>
+          <w:bCs/>
+          <w:color w:val="000000" w:themeColor="text1"/>
+          <w:spacing w:val="-2"/>
+          <w:sz w:val="26"/>
+          <w:szCs w:val="26"/>
+          <w:lang w:val="pt-BR"/>
+        </w:rPr>
+        <w:tab/>
+      </w:r>
+      <w:r>
+        <w:rPr>
+          <w:b/>
+          <w:bCs/>
+          <w:color w:val="000000" w:themeColor="text1"/>
+          <w:spacing w:val="-2"/>
+          <w:sz w:val="26"/>
+          <w:szCs w:val="26"/>
+          <w:lang w:val="pt-BR"/>
+        </w:rPr>
+        <w:tab/>
+      </w:r>
+      <w:r>
+        <w:rPr>
+          <w:b/>
+          <w:bCs/>
+          <w:color w:val="000000" w:themeColor="text1"/>
+          <w:spacing w:val="-2"/>
+          <w:sz w:val="26"/>
+          <w:szCs w:val="26"/>
+          <w:lang w:val="pt-BR"/>
+        </w:rPr>
+        <w:t>{</w:t>
+      </w:r>
+    </w:p>
+    <w:p>
+      <w:pPr>
+        <w:pStyle w:val="PargrafodaLista"/>
+        <w:tabs>
+          <w:tab w:val="left" w:pos="385"/>
+        </w:tabs>
+        <w:ind w:left="385"/>
+        <w:rPr>
+          <w:b/>
+          <w:bCs/>
+          <w:color w:val="000000" w:themeColor="text1"/>
+          <w:spacing w:val="-2"/>
+          <w:sz w:val="26"/>
+          <w:szCs w:val="26"/>
+          <w:lang w:val="pt-BR"/>
+        </w:rPr>
+      </w:pPr>
+      <w:r>
+        <w:rPr>
+          <w:b/>
+          <w:bCs/>
+          <w:color w:val="000000" w:themeColor="text1"/>
+          <w:spacing w:val="-2"/>
+          <w:sz w:val="26"/>
+          <w:szCs w:val="26"/>
+          <w:lang w:val="pt-BR"/>
+        </w:rPr>
+        <w:t xml:space="preserve">    </w:t>
+      </w:r>
+    </w:p>
+    <w:p>
+      <w:pPr>
+        <w:pStyle w:val="PargrafodaLista"/>
+        <w:tabs>
+          <w:tab w:val="left" w:pos="385"/>
+        </w:tabs>
+        <w:ind w:left="385"/>
+        <w:rPr>
+          <w:b/>
+          <w:bCs/>
+          <w:color w:val="000000" w:themeColor="text1"/>
+          <w:spacing w:val="-2"/>
+          <w:sz w:val="26"/>
+          <w:szCs w:val="26"/>
+          <w:lang w:val="pt-BR"/>
+        </w:rPr>
+      </w:pPr>
+      <w:r>
+        <w:rPr>
+          <w:b/>
+          <w:bCs/>
+          <w:color w:val="000000" w:themeColor="text1"/>
+          <w:spacing w:val="-2"/>
+          <w:sz w:val="26"/>
+          <w:szCs w:val="26"/>
+          <w:lang w:val="pt-BR"/>
+        </w:rPr>
+        <w:t xml:space="preserve">    </w:t>
+      </w:r>
+      <w:r>
+        <w:rPr>
+          <w:b/>
+          <w:bCs/>
+          <w:color w:val="000000" w:themeColor="text1"/>
+          <w:spacing w:val="-2"/>
+          <w:sz w:val="26"/>
+          <w:szCs w:val="26"/>
+          <w:lang w:val="pt-BR"/>
+        </w:rPr>
+        <w:tab/>
+      </w:r>
+      <w:r>
+        <w:rPr>
+          <w:b/>
+          <w:bCs/>
+          <w:color w:val="000000" w:themeColor="text1"/>
+          <w:spacing w:val="-2"/>
+          <w:sz w:val="26"/>
+          <w:szCs w:val="26"/>
+          <w:lang w:val="pt-BR"/>
+        </w:rPr>
+        <w:tab/>
+      </w:r>
+      <w:proofErr w:type="spellStart"/>
+      <w:r>
+        <w:rPr>
+          <w:b/>
+          <w:bCs/>
+          <w:color w:val="000000" w:themeColor="text1"/>
+          <w:spacing w:val="-2"/>
+          <w:sz w:val="26"/>
+          <w:szCs w:val="26"/>
+          <w:lang w:val="pt-BR"/>
+        </w:rPr>
+        <w:t>int</w:t>
+      </w:r>
+      <w:proofErr w:type="spellEnd"/>
+      <w:r>
+        <w:rPr>
+          <w:b/>
+          <w:bCs/>
+          <w:color w:val="000000" w:themeColor="text1"/>
+          <w:spacing w:val="-2"/>
+          <w:sz w:val="26"/>
+          <w:szCs w:val="26"/>
+          <w:lang w:val="pt-BR"/>
+        </w:rPr>
+        <w:t xml:space="preserve"> x = 0; </w:t>
+      </w:r>
+    </w:p>
+    <w:p>
+      <w:pPr>
+        <w:pStyle w:val="PargrafodaLista"/>
+        <w:tabs>
+          <w:tab w:val="left" w:pos="385"/>
+        </w:tabs>
+        <w:ind w:left="385"/>
+        <w:rPr>
+          <w:b/>
+          <w:bCs/>
+          <w:color w:val="000000" w:themeColor="text1"/>
+          <w:spacing w:val="-2"/>
+          <w:sz w:val="26"/>
+          <w:szCs w:val="26"/>
+          <w:lang w:val="pt-BR"/>
+        </w:rPr>
+      </w:pPr>
+      <w:r>
+        <w:rPr>
+          <w:b/>
+          <w:bCs/>
+          <w:color w:val="000000" w:themeColor="text1"/>
+          <w:spacing w:val="-2"/>
+          <w:sz w:val="26"/>
+          <w:szCs w:val="26"/>
+          <w:lang w:val="pt-BR"/>
+        </w:rPr>
+        <w:t xml:space="preserve">    </w:t>
+      </w:r>
+      <w:r>
+        <w:rPr>
+          <w:b/>
+          <w:bCs/>
+          <w:color w:val="000000" w:themeColor="text1"/>
+          <w:spacing w:val="-2"/>
+          <w:sz w:val="26"/>
+          <w:szCs w:val="26"/>
+          <w:lang w:val="pt-BR"/>
+        </w:rPr>
+        <w:tab/>
+      </w:r>
+      <w:r>
+        <w:rPr>
+          <w:b/>
+          <w:bCs/>
+          <w:color w:val="000000" w:themeColor="text1"/>
+          <w:spacing w:val="-2"/>
+          <w:sz w:val="26"/>
+          <w:szCs w:val="26"/>
+          <w:lang w:val="pt-BR"/>
+        </w:rPr>
+        <w:tab/>
+      </w:r>
+      <w:proofErr w:type="spellStart"/>
+      <w:r>
+        <w:rPr>
+          <w:b/>
+          <w:bCs/>
+          <w:color w:val="000000" w:themeColor="text1"/>
+          <w:spacing w:val="-2"/>
+          <w:sz w:val="26"/>
+          <w:szCs w:val="26"/>
+          <w:lang w:val="pt-BR"/>
+        </w:rPr>
+        <w:t>int</w:t>
+      </w:r>
+      <w:proofErr w:type="spellEnd"/>
+      <w:r>
+        <w:rPr>
+          <w:b/>
+          <w:bCs/>
+          <w:color w:val="000000" w:themeColor="text1"/>
+          <w:spacing w:val="-2"/>
+          <w:sz w:val="26"/>
+          <w:szCs w:val="26"/>
+          <w:lang w:val="pt-BR"/>
+        </w:rPr>
+        <w:t xml:space="preserve"> y = 0;</w:t>
+      </w:r>
+    </w:p>
+    <w:p>
+      <w:pPr>
+        <w:pStyle w:val="PargrafodaLista"/>
+        <w:tabs>
+          <w:tab w:val="left" w:pos="385"/>
+        </w:tabs>
+        <w:ind w:left="385"/>
+        <w:rPr>
+          <w:b/>
+          <w:bCs/>
+          <w:color w:val="000000" w:themeColor="text1"/>
+          <w:spacing w:val="-2"/>
+          <w:sz w:val="26"/>
+          <w:szCs w:val="26"/>
+          <w:lang w:val="pt-BR"/>
+        </w:rPr>
+      </w:pPr>
+    </w:p>
+    <w:p>
+      <w:pPr>
+        <w:pStyle w:val="PargrafodaLista"/>
+        <w:tabs>
+          <w:tab w:val="left" w:pos="385"/>
+        </w:tabs>
+        <w:ind w:left="385"/>
+        <w:rPr>
+          <w:b/>
+          <w:bCs/>
+          <w:color w:val="000000" w:themeColor="text1"/>
+          <w:spacing w:val="-2"/>
+          <w:sz w:val="26"/>
+          <w:szCs w:val="26"/>
+          <w:lang w:val="pt-BR"/>
+        </w:rPr>
+      </w:pPr>
+      <w:r>
+        <w:rPr>
+          <w:b/>
+          <w:bCs/>
+          <w:color w:val="000000" w:themeColor="text1"/>
+          <w:spacing w:val="-2"/>
+          <w:sz w:val="26"/>
+          <w:szCs w:val="26"/>
+          <w:lang w:val="pt-BR"/>
+        </w:rPr>
+        <w:t xml:space="preserve">    </w:t>
+      </w:r>
+      <w:r>
+        <w:rPr>
+          <w:b/>
+          <w:bCs/>
+          <w:color w:val="000000" w:themeColor="text1"/>
+          <w:spacing w:val="-2"/>
+          <w:sz w:val="26"/>
+          <w:szCs w:val="26"/>
+          <w:lang w:val="pt-BR"/>
+        </w:rPr>
+        <w:tab/>
+      </w:r>
+      <w:r>
+        <w:rPr>
+          <w:b/>
+          <w:bCs/>
+          <w:color w:val="000000" w:themeColor="text1"/>
+          <w:spacing w:val="-2"/>
+          <w:sz w:val="26"/>
+          <w:szCs w:val="26"/>
+          <w:lang w:val="pt-BR"/>
+        </w:rPr>
+        <w:tab/>
+      </w:r>
+      <w:proofErr w:type="spellStart"/>
+      <w:proofErr w:type="gramStart"/>
+      <w:r>
+        <w:rPr>
+          <w:b/>
+          <w:bCs/>
+          <w:color w:val="000000" w:themeColor="text1"/>
+          <w:spacing w:val="-2"/>
+          <w:sz w:val="26"/>
+          <w:szCs w:val="26"/>
+          <w:lang w:val="pt-BR"/>
+        </w:rPr>
+        <w:t>printf</w:t>
+      </w:r>
+      <w:proofErr w:type="spellEnd"/>
+      <w:r>
+        <w:rPr>
+          <w:b/>
+          <w:bCs/>
+          <w:color w:val="000000" w:themeColor="text1"/>
+          <w:spacing w:val="-2"/>
+          <w:sz w:val="26"/>
+          <w:szCs w:val="26"/>
+          <w:lang w:val="pt-BR"/>
+        </w:rPr>
+        <w:t>(</w:t>
+      </w:r>
+      <w:proofErr w:type="gramEnd"/>
+      <w:r>
+        <w:rPr>
+          <w:b/>
+          <w:bCs/>
+          <w:color w:val="000000" w:themeColor="text1"/>
+          <w:spacing w:val="-2"/>
+          <w:sz w:val="26"/>
+          <w:szCs w:val="26"/>
+          <w:lang w:val="pt-BR"/>
+        </w:rPr>
+        <w:t xml:space="preserve">"Digite o 1 </w:t>
+      </w:r>
+      <w:proofErr w:type="spellStart"/>
+      <w:r>
+        <w:rPr>
+          <w:b/>
+          <w:bCs/>
+          <w:color w:val="000000" w:themeColor="text1"/>
+          <w:spacing w:val="-2"/>
+          <w:sz w:val="26"/>
+          <w:szCs w:val="26"/>
+          <w:lang w:val="pt-BR"/>
+        </w:rPr>
+        <w:t>numero</w:t>
+      </w:r>
+      <w:proofErr w:type="spellEnd"/>
+      <w:r>
+        <w:rPr>
+          <w:b/>
+          <w:bCs/>
+          <w:color w:val="000000" w:themeColor="text1"/>
+          <w:spacing w:val="-2"/>
+          <w:sz w:val="26"/>
+          <w:szCs w:val="26"/>
+          <w:lang w:val="pt-BR"/>
+        </w:rPr>
+        <w:t xml:space="preserve"> inteiro: ");</w:t>
+      </w:r>
+    </w:p>
+    <w:p>
+      <w:pPr>
+        <w:pStyle w:val="PargrafodaLista"/>
+        <w:tabs>
+          <w:tab w:val="left" w:pos="385"/>
+        </w:tabs>
+        <w:ind w:left="385"/>
+        <w:rPr>
+          <w:b/>
+          <w:bCs/>
+          <w:color w:val="000000" w:themeColor="text1"/>
+          <w:spacing w:val="-2"/>
+          <w:sz w:val="26"/>
+          <w:szCs w:val="26"/>
+          <w:lang w:val="pt-BR"/>
+        </w:rPr>
+      </w:pPr>
+      <w:r>
+        <w:rPr>
+          <w:b/>
+          <w:bCs/>
+          <w:color w:val="000000" w:themeColor="text1"/>
+          <w:spacing w:val="-2"/>
+          <w:sz w:val="26"/>
+          <w:szCs w:val="26"/>
+          <w:lang w:val="pt-BR"/>
+        </w:rPr>
+        <w:t xml:space="preserve">    </w:t>
+      </w:r>
+      <w:r>
+        <w:rPr>
+          <w:b/>
+          <w:bCs/>
+          <w:color w:val="000000" w:themeColor="text1"/>
+          <w:spacing w:val="-2"/>
+          <w:sz w:val="26"/>
+          <w:szCs w:val="26"/>
+          <w:lang w:val="pt-BR"/>
+        </w:rPr>
+        <w:tab/>
+      </w:r>
+      <w:r>
+        <w:rPr>
+          <w:b/>
+          <w:bCs/>
+          <w:color w:val="000000" w:themeColor="text1"/>
+          <w:spacing w:val="-2"/>
+          <w:sz w:val="26"/>
+          <w:szCs w:val="26"/>
+          <w:lang w:val="pt-BR"/>
+        </w:rPr>
+        <w:tab/>
+      </w:r>
+      <w:proofErr w:type="spellStart"/>
+      <w:proofErr w:type="gramStart"/>
+      <w:r>
+        <w:rPr>
+          <w:b/>
+          <w:bCs/>
+          <w:color w:val="000000" w:themeColor="text1"/>
+          <w:spacing w:val="-2"/>
+          <w:sz w:val="26"/>
+          <w:szCs w:val="26"/>
+          <w:lang w:val="pt-BR"/>
+        </w:rPr>
+        <w:t>scanf</w:t>
+      </w:r>
+      <w:proofErr w:type="spellEnd"/>
+      <w:r>
+        <w:rPr>
+          <w:b/>
+          <w:bCs/>
+          <w:color w:val="000000" w:themeColor="text1"/>
+          <w:spacing w:val="-2"/>
+          <w:sz w:val="26"/>
+          <w:szCs w:val="26"/>
+          <w:lang w:val="pt-BR"/>
+        </w:rPr>
+        <w:t>(</w:t>
+      </w:r>
+      <w:proofErr w:type="gramEnd"/>
+      <w:r>
+        <w:rPr>
+          <w:b/>
+          <w:bCs/>
+          <w:color w:val="000000" w:themeColor="text1"/>
+          <w:spacing w:val="-2"/>
+          <w:sz w:val="26"/>
+          <w:szCs w:val="26"/>
+          <w:lang w:val="pt-BR"/>
+        </w:rPr>
+        <w:t>"%d", &amp;x);</w:t>
+      </w:r>
+    </w:p>
+    <w:p>
+      <w:pPr>
+        <w:pStyle w:val="PargrafodaLista"/>
+        <w:tabs>
+          <w:tab w:val="left" w:pos="385"/>
+        </w:tabs>
+        <w:ind w:left="385"/>
+        <w:rPr>
+          <w:b/>
+          <w:bCs/>
+          <w:color w:val="000000" w:themeColor="text1"/>
+          <w:spacing w:val="-2"/>
+          <w:sz w:val="26"/>
+          <w:szCs w:val="26"/>
+          <w:lang w:val="pt-BR"/>
+        </w:rPr>
+      </w:pPr>
+    </w:p>
+    <w:p>
+      <w:pPr>
+        <w:pStyle w:val="PargrafodaLista"/>
+        <w:tabs>
+          <w:tab w:val="left" w:pos="385"/>
+        </w:tabs>
+        <w:ind w:left="385"/>
+        <w:rPr>
+          <w:b/>
+          <w:bCs/>
+          <w:color w:val="000000" w:themeColor="text1"/>
+          <w:spacing w:val="-2"/>
+          <w:sz w:val="26"/>
+          <w:szCs w:val="26"/>
+          <w:lang w:val="pt-BR"/>
+        </w:rPr>
+      </w:pPr>
+      <w:r>
+        <w:rPr>
+          <w:b/>
+          <w:bCs/>
+          <w:color w:val="000000" w:themeColor="text1"/>
+          <w:spacing w:val="-2"/>
+          <w:sz w:val="26"/>
+          <w:szCs w:val="26"/>
+          <w:lang w:val="pt-BR"/>
+        </w:rPr>
+        <w:t xml:space="preserve">    </w:t>
+      </w:r>
+      <w:r>
+        <w:rPr>
+          <w:b/>
+          <w:bCs/>
+          <w:color w:val="000000" w:themeColor="text1"/>
+          <w:spacing w:val="-2"/>
+          <w:sz w:val="26"/>
+          <w:szCs w:val="26"/>
+          <w:lang w:val="pt-BR"/>
+        </w:rPr>
+        <w:tab/>
+      </w:r>
+      <w:r>
+        <w:rPr>
+          <w:b/>
+          <w:bCs/>
+          <w:color w:val="000000" w:themeColor="text1"/>
+          <w:spacing w:val="-2"/>
+          <w:sz w:val="26"/>
+          <w:szCs w:val="26"/>
+          <w:lang w:val="pt-BR"/>
+        </w:rPr>
+        <w:tab/>
+      </w:r>
+      <w:proofErr w:type="spellStart"/>
+      <w:proofErr w:type="gramStart"/>
+      <w:r>
+        <w:rPr>
+          <w:b/>
+          <w:bCs/>
+          <w:color w:val="000000" w:themeColor="text1"/>
+          <w:spacing w:val="-2"/>
+          <w:sz w:val="26"/>
+          <w:szCs w:val="26"/>
+          <w:lang w:val="pt-BR"/>
+        </w:rPr>
+        <w:t>printf</w:t>
+      </w:r>
+      <w:proofErr w:type="spellEnd"/>
+      <w:r>
+        <w:rPr>
+          <w:b/>
+          <w:bCs/>
+          <w:color w:val="000000" w:themeColor="text1"/>
+          <w:spacing w:val="-2"/>
+          <w:sz w:val="26"/>
+          <w:szCs w:val="26"/>
+          <w:lang w:val="pt-BR"/>
+        </w:rPr>
+        <w:t>(</w:t>
+      </w:r>
+      <w:proofErr w:type="gramEnd"/>
+      <w:r>
+        <w:rPr>
+          <w:b/>
+          <w:bCs/>
+          <w:color w:val="000000" w:themeColor="text1"/>
+          <w:spacing w:val="-2"/>
+          <w:sz w:val="26"/>
+          <w:szCs w:val="26"/>
+          <w:lang w:val="pt-BR"/>
+        </w:rPr>
+        <w:t xml:space="preserve">"Digite o 2 </w:t>
+      </w:r>
+      <w:proofErr w:type="spellStart"/>
+      <w:r>
+        <w:rPr>
+          <w:b/>
+          <w:bCs/>
+          <w:color w:val="000000" w:themeColor="text1"/>
+          <w:spacing w:val="-2"/>
+          <w:sz w:val="26"/>
+          <w:szCs w:val="26"/>
+          <w:lang w:val="pt-BR"/>
+        </w:rPr>
+        <w:t>numero</w:t>
+      </w:r>
+      <w:proofErr w:type="spellEnd"/>
+      <w:r>
+        <w:rPr>
+          <w:b/>
+          <w:bCs/>
+          <w:color w:val="000000" w:themeColor="text1"/>
+          <w:spacing w:val="-2"/>
+          <w:sz w:val="26"/>
+          <w:szCs w:val="26"/>
+          <w:lang w:val="pt-BR"/>
+        </w:rPr>
+        <w:t xml:space="preserve"> inteiro: ");</w:t>
+      </w:r>
+    </w:p>
+    <w:p>
+      <w:pPr>
+        <w:pStyle w:val="PargrafodaLista"/>
+        <w:tabs>
+          <w:tab w:val="left" w:pos="385"/>
+        </w:tabs>
+        <w:ind w:left="385"/>
+        <w:rPr>
+          <w:b/>
+          <w:bCs/>
+          <w:color w:val="000000" w:themeColor="text1"/>
+          <w:spacing w:val="-2"/>
+          <w:sz w:val="26"/>
+          <w:szCs w:val="26"/>
+          <w:lang w:val="pt-BR"/>
+        </w:rPr>
+      </w:pPr>
+      <w:r>
+        <w:rPr>
+          <w:b/>
+          <w:bCs/>
+          <w:color w:val="000000" w:themeColor="text1"/>
+          <w:spacing w:val="-2"/>
+          <w:sz w:val="26"/>
+          <w:szCs w:val="26"/>
+          <w:lang w:val="pt-BR"/>
+        </w:rPr>
+        <w:t xml:space="preserve">    </w:t>
+      </w:r>
+      <w:r>
+        <w:rPr>
+          <w:b/>
+          <w:bCs/>
+          <w:color w:val="000000" w:themeColor="text1"/>
+          <w:spacing w:val="-2"/>
+          <w:sz w:val="26"/>
+          <w:szCs w:val="26"/>
+          <w:lang w:val="pt-BR"/>
+        </w:rPr>
+        <w:tab/>
+      </w:r>
+      <w:r>
+        <w:rPr>
+          <w:b/>
+          <w:bCs/>
+          <w:color w:val="000000" w:themeColor="text1"/>
+          <w:spacing w:val="-2"/>
+          <w:sz w:val="26"/>
+          <w:szCs w:val="26"/>
+          <w:lang w:val="pt-BR"/>
+        </w:rPr>
+        <w:tab/>
+      </w:r>
+      <w:proofErr w:type="spellStart"/>
+      <w:proofErr w:type="gramStart"/>
+      <w:r>
+        <w:rPr>
+          <w:b/>
+          <w:bCs/>
+          <w:color w:val="000000" w:themeColor="text1"/>
+          <w:spacing w:val="-2"/>
+          <w:sz w:val="26"/>
+          <w:szCs w:val="26"/>
+          <w:lang w:val="pt-BR"/>
+        </w:rPr>
+        <w:t>scanf</w:t>
+      </w:r>
+      <w:proofErr w:type="spellEnd"/>
+      <w:r>
+        <w:rPr>
+          <w:b/>
+          <w:bCs/>
+          <w:color w:val="000000" w:themeColor="text1"/>
+          <w:spacing w:val="-2"/>
+          <w:sz w:val="26"/>
+          <w:szCs w:val="26"/>
+          <w:lang w:val="pt-BR"/>
+        </w:rPr>
+        <w:t>(</w:t>
+      </w:r>
+      <w:proofErr w:type="gramEnd"/>
+      <w:r>
+        <w:rPr>
+          <w:b/>
+          <w:bCs/>
+          <w:color w:val="000000" w:themeColor="text1"/>
+          <w:spacing w:val="-2"/>
+          <w:sz w:val="26"/>
+          <w:szCs w:val="26"/>
+          <w:lang w:val="pt-BR"/>
+        </w:rPr>
+        <w:t>"%d", &amp;y);</w:t>
+      </w:r>
+    </w:p>
+    <w:p>
+      <w:pPr>
+        <w:pStyle w:val="PargrafodaLista"/>
+        <w:tabs>
+          <w:tab w:val="left" w:pos="385"/>
+        </w:tabs>
+        <w:ind w:left="385"/>
+        <w:rPr>
+          <w:b/>
+          <w:bCs/>
+          <w:color w:val="000000" w:themeColor="text1"/>
+          <w:spacing w:val="-2"/>
+          <w:sz w:val="26"/>
+          <w:szCs w:val="26"/>
+          <w:lang w:val="pt-BR"/>
+        </w:rPr>
+      </w:pPr>
+    </w:p>
+    <w:p>
+      <w:pPr>
+        <w:pStyle w:val="PargrafodaLista"/>
+        <w:tabs>
+          <w:tab w:val="left" w:pos="385"/>
+        </w:tabs>
+        <w:ind w:left="385"/>
+        <w:rPr>
+          <w:b/>
+          <w:bCs/>
+          <w:color w:val="000000" w:themeColor="text1"/>
+          <w:spacing w:val="-2"/>
+          <w:sz w:val="26"/>
+          <w:szCs w:val="26"/>
+          <w:lang w:val="pt-BR"/>
+        </w:rPr>
+      </w:pPr>
+      <w:r>
+        <w:rPr>
+          <w:b/>
+          <w:bCs/>
+          <w:color w:val="000000" w:themeColor="text1"/>
+          <w:spacing w:val="-2"/>
+          <w:sz w:val="26"/>
+          <w:szCs w:val="26"/>
+          <w:lang w:val="pt-BR"/>
+        </w:rPr>
+        <w:t xml:space="preserve">    </w:t>
+      </w:r>
+      <w:r>
+        <w:rPr>
+          <w:b/>
+          <w:bCs/>
+          <w:color w:val="000000" w:themeColor="text1"/>
+          <w:spacing w:val="-2"/>
+          <w:sz w:val="26"/>
+          <w:szCs w:val="26"/>
+          <w:lang w:val="pt-BR"/>
+        </w:rPr>
+        <w:tab/>
+      </w:r>
+      <w:r>
+        <w:rPr>
+          <w:b/>
+          <w:bCs/>
+          <w:color w:val="000000" w:themeColor="text1"/>
+          <w:spacing w:val="-2"/>
+          <w:sz w:val="26"/>
+          <w:szCs w:val="26"/>
+          <w:lang w:val="pt-BR"/>
+        </w:rPr>
+        <w:tab/>
+      </w:r>
+      <w:proofErr w:type="spellStart"/>
+      <w:r>
+        <w:rPr>
+          <w:b/>
+          <w:bCs/>
+          <w:color w:val="000000" w:themeColor="text1"/>
+          <w:spacing w:val="-2"/>
+          <w:sz w:val="26"/>
+          <w:szCs w:val="26"/>
+          <w:lang w:val="pt-BR"/>
+        </w:rPr>
+        <w:t>if</w:t>
+      </w:r>
+      <w:proofErr w:type="spellEnd"/>
+      <w:r>
+        <w:rPr>
+          <w:b/>
+          <w:bCs/>
+          <w:color w:val="000000" w:themeColor="text1"/>
+          <w:spacing w:val="-2"/>
+          <w:sz w:val="26"/>
+          <w:szCs w:val="26"/>
+          <w:lang w:val="pt-BR"/>
+        </w:rPr>
+        <w:t xml:space="preserve"> (maior(</w:t>
+      </w:r>
+      <w:proofErr w:type="spellStart"/>
+      <w:proofErr w:type="gramStart"/>
+      <w:r>
+        <w:rPr>
+          <w:b/>
+          <w:bCs/>
+          <w:color w:val="000000" w:themeColor="text1"/>
+          <w:spacing w:val="-2"/>
+          <w:sz w:val="26"/>
+          <w:szCs w:val="26"/>
+          <w:lang w:val="pt-BR"/>
+        </w:rPr>
+        <w:t>x,y</w:t>
+      </w:r>
+      <w:proofErr w:type="spellEnd"/>
+      <w:proofErr w:type="gramEnd"/>
+      <w:r>
+        <w:rPr>
+          <w:b/>
+          <w:bCs/>
+          <w:color w:val="000000" w:themeColor="text1"/>
+          <w:spacing w:val="-2"/>
+          <w:sz w:val="26"/>
+          <w:szCs w:val="26"/>
+          <w:lang w:val="pt-BR"/>
+        </w:rPr>
+        <w:t>) == 1)</w:t>
+      </w:r>
+    </w:p>
+    <w:p>
+      <w:pPr>
+        <w:pStyle w:val="PargrafodaLista"/>
+        <w:tabs>
+          <w:tab w:val="left" w:pos="385"/>
+        </w:tabs>
+        <w:ind w:left="385"/>
+        <w:rPr>
+          <w:b/>
+          <w:bCs/>
+          <w:color w:val="000000" w:themeColor="text1"/>
+          <w:spacing w:val="-2"/>
+          <w:sz w:val="26"/>
+          <w:szCs w:val="26"/>
+          <w:lang w:val="pt-BR"/>
+        </w:rPr>
+      </w:pPr>
+      <w:r>
+        <w:rPr>
+          <w:b/>
+          <w:bCs/>
+          <w:color w:val="000000" w:themeColor="text1"/>
+          <w:spacing w:val="-2"/>
+          <w:sz w:val="26"/>
+          <w:szCs w:val="26"/>
+          <w:lang w:val="pt-BR"/>
+        </w:rPr>
+        <w:t xml:space="preserve">        </w:t>
+      </w:r>
+      <w:r>
+        <w:rPr>
+          <w:b/>
+          <w:bCs/>
+          <w:color w:val="000000" w:themeColor="text1"/>
+          <w:spacing w:val="-2"/>
+          <w:sz w:val="26"/>
+          <w:szCs w:val="26"/>
+          <w:lang w:val="pt-BR"/>
+        </w:rPr>
+        <w:tab/>
+      </w:r>
+      <w:r>
+        <w:rPr>
+          <w:b/>
+          <w:bCs/>
+          <w:color w:val="000000" w:themeColor="text1"/>
+          <w:spacing w:val="-2"/>
+          <w:sz w:val="26"/>
+          <w:szCs w:val="26"/>
+          <w:lang w:val="pt-BR"/>
+        </w:rPr>
+        <w:tab/>
+      </w:r>
+      <w:proofErr w:type="spellStart"/>
+      <w:proofErr w:type="gramStart"/>
+      <w:r>
+        <w:rPr>
+          <w:b/>
+          <w:bCs/>
+          <w:color w:val="000000" w:themeColor="text1"/>
+          <w:spacing w:val="-2"/>
+          <w:sz w:val="26"/>
+          <w:szCs w:val="26"/>
+          <w:lang w:val="pt-BR"/>
+        </w:rPr>
+        <w:t>printf</w:t>
+      </w:r>
+      <w:proofErr w:type="spellEnd"/>
+      <w:r>
+        <w:rPr>
+          <w:b/>
+          <w:bCs/>
+          <w:color w:val="000000" w:themeColor="text1"/>
+          <w:spacing w:val="-2"/>
+          <w:sz w:val="26"/>
+          <w:szCs w:val="26"/>
+          <w:lang w:val="pt-BR"/>
+        </w:rPr>
+        <w:t>(</w:t>
+      </w:r>
+      <w:proofErr w:type="gramEnd"/>
+      <w:r>
+        <w:rPr>
+          <w:b/>
+          <w:bCs/>
+          <w:color w:val="000000" w:themeColor="text1"/>
+          <w:spacing w:val="-2"/>
+          <w:sz w:val="26"/>
+          <w:szCs w:val="26"/>
+          <w:lang w:val="pt-BR"/>
+        </w:rPr>
+        <w:t xml:space="preserve">"Os </w:t>
+      </w:r>
+      <w:proofErr w:type="spellStart"/>
+      <w:r>
+        <w:rPr>
+          <w:b/>
+          <w:bCs/>
+          <w:color w:val="000000" w:themeColor="text1"/>
+          <w:spacing w:val="-2"/>
+          <w:sz w:val="26"/>
+          <w:szCs w:val="26"/>
+          <w:lang w:val="pt-BR"/>
+        </w:rPr>
+        <w:t>numeros</w:t>
+      </w:r>
+      <w:proofErr w:type="spellEnd"/>
+      <w:r>
+        <w:rPr>
+          <w:b/>
+          <w:bCs/>
+          <w:color w:val="000000" w:themeColor="text1"/>
+          <w:spacing w:val="-2"/>
+          <w:sz w:val="26"/>
+          <w:szCs w:val="26"/>
+          <w:lang w:val="pt-BR"/>
+        </w:rPr>
+        <w:t xml:space="preserve"> %d e %d </w:t>
+      </w:r>
+      <w:proofErr w:type="spellStart"/>
+      <w:r>
+        <w:rPr>
+          <w:b/>
+          <w:bCs/>
+          <w:color w:val="000000" w:themeColor="text1"/>
+          <w:spacing w:val="-2"/>
+          <w:sz w:val="26"/>
+          <w:szCs w:val="26"/>
+          <w:lang w:val="pt-BR"/>
+        </w:rPr>
+        <w:t>sao</w:t>
+      </w:r>
+      <w:proofErr w:type="spellEnd"/>
+      <w:r>
+        <w:rPr>
+          <w:b/>
+          <w:bCs/>
+          <w:color w:val="000000" w:themeColor="text1"/>
+          <w:spacing w:val="-2"/>
+          <w:sz w:val="26"/>
+          <w:szCs w:val="26"/>
+          <w:lang w:val="pt-BR"/>
+        </w:rPr>
+        <w:t xml:space="preserve"> iguais.", x, y);</w:t>
+      </w:r>
+    </w:p>
+    <w:p>
+      <w:pPr>
+        <w:pStyle w:val="PargrafodaLista"/>
+        <w:tabs>
+          <w:tab w:val="left" w:pos="385"/>
+        </w:tabs>
+        <w:ind w:left="385"/>
+        <w:rPr>
+          <w:b/>
+          <w:bCs/>
+          <w:color w:val="000000" w:themeColor="text1"/>
+          <w:spacing w:val="-2"/>
+          <w:sz w:val="26"/>
+          <w:szCs w:val="26"/>
+          <w:lang w:val="pt-BR"/>
+        </w:rPr>
+      </w:pPr>
+      <w:r>
+        <w:rPr>
+          <w:b/>
+          <w:bCs/>
+          <w:color w:val="000000" w:themeColor="text1"/>
+          <w:spacing w:val="-2"/>
+          <w:sz w:val="26"/>
+          <w:szCs w:val="26"/>
+          <w:lang w:val="pt-BR"/>
+        </w:rPr>
+        <w:t xml:space="preserve">    </w:t>
+      </w:r>
+      <w:r>
+        <w:rPr>
+          <w:b/>
+          <w:bCs/>
+          <w:color w:val="000000" w:themeColor="text1"/>
+          <w:spacing w:val="-2"/>
+          <w:sz w:val="26"/>
+          <w:szCs w:val="26"/>
+          <w:lang w:val="pt-BR"/>
+        </w:rPr>
+        <w:tab/>
+      </w:r>
+      <w:r>
+        <w:rPr>
+          <w:b/>
+          <w:bCs/>
+          <w:color w:val="000000" w:themeColor="text1"/>
+          <w:spacing w:val="-2"/>
+          <w:sz w:val="26"/>
+          <w:szCs w:val="26"/>
+          <w:lang w:val="pt-BR"/>
+        </w:rPr>
+        <w:tab/>
+      </w:r>
+      <w:proofErr w:type="spellStart"/>
+      <w:r>
+        <w:rPr>
+          <w:b/>
+          <w:bCs/>
+          <w:color w:val="000000" w:themeColor="text1"/>
+          <w:spacing w:val="-2"/>
+          <w:sz w:val="26"/>
+          <w:szCs w:val="26"/>
+          <w:lang w:val="pt-BR"/>
+        </w:rPr>
+        <w:t>else</w:t>
+      </w:r>
+      <w:proofErr w:type="spellEnd"/>
+    </w:p>
+    <w:p>
+      <w:pPr>
+        <w:pStyle w:val="PargrafodaLista"/>
+        <w:tabs>
+          <w:tab w:val="left" w:pos="385"/>
+        </w:tabs>
+        <w:ind w:left="385"/>
+        <w:rPr>
+          <w:b/>
+          <w:bCs/>
+          <w:color w:val="000000" w:themeColor="text1"/>
+          <w:spacing w:val="-2"/>
+          <w:sz w:val="26"/>
+          <w:szCs w:val="26"/>
+          <w:lang w:val="pt-BR"/>
+        </w:rPr>
+      </w:pPr>
+      <w:r>
+        <w:rPr>
+          <w:b/>
+          <w:bCs/>
+          <w:color w:val="000000" w:themeColor="text1"/>
+          <w:spacing w:val="-2"/>
+          <w:sz w:val="26"/>
+          <w:szCs w:val="26"/>
+          <w:lang w:val="pt-BR"/>
+        </w:rPr>
+        <w:t xml:space="preserve">        </w:t>
+      </w:r>
+      <w:r>
+        <w:rPr>
+          <w:b/>
+          <w:bCs/>
+          <w:color w:val="000000" w:themeColor="text1"/>
+          <w:spacing w:val="-2"/>
+          <w:sz w:val="26"/>
+          <w:szCs w:val="26"/>
+          <w:lang w:val="pt-BR"/>
+        </w:rPr>
+        <w:tab/>
+      </w:r>
+      <w:r>
+        <w:rPr>
+          <w:b/>
+          <w:bCs/>
+          <w:color w:val="000000" w:themeColor="text1"/>
+          <w:spacing w:val="-2"/>
+          <w:sz w:val="26"/>
+          <w:szCs w:val="26"/>
+          <w:lang w:val="pt-BR"/>
+        </w:rPr>
+        <w:tab/>
+      </w:r>
+      <w:proofErr w:type="spellStart"/>
+      <w:proofErr w:type="gramStart"/>
+      <w:r>
+        <w:rPr>
+          <w:b/>
+          <w:bCs/>
+          <w:color w:val="000000" w:themeColor="text1"/>
+          <w:spacing w:val="-2"/>
+          <w:sz w:val="26"/>
+          <w:szCs w:val="26"/>
+          <w:lang w:val="pt-BR"/>
+        </w:rPr>
+        <w:t>printf</w:t>
+      </w:r>
+      <w:proofErr w:type="spellEnd"/>
+      <w:r>
+        <w:rPr>
+          <w:b/>
+          <w:bCs/>
+          <w:color w:val="000000" w:themeColor="text1"/>
+          <w:spacing w:val="-2"/>
+          <w:sz w:val="26"/>
+          <w:szCs w:val="26"/>
+          <w:lang w:val="pt-BR"/>
+        </w:rPr>
+        <w:t>(</w:t>
+      </w:r>
+      <w:proofErr w:type="gramEnd"/>
+      <w:r>
+        <w:rPr>
+          <w:b/>
+          <w:bCs/>
+          <w:color w:val="000000" w:themeColor="text1"/>
+          <w:spacing w:val="-2"/>
+          <w:sz w:val="26"/>
+          <w:szCs w:val="26"/>
+          <w:lang w:val="pt-BR"/>
+        </w:rPr>
+        <w:t xml:space="preserve">"O maior </w:t>
+      </w:r>
+      <w:proofErr w:type="spellStart"/>
+      <w:r>
+        <w:rPr>
+          <w:b/>
+          <w:bCs/>
+          <w:color w:val="000000" w:themeColor="text1"/>
+          <w:spacing w:val="-2"/>
+          <w:sz w:val="26"/>
+          <w:szCs w:val="26"/>
+          <w:lang w:val="pt-BR"/>
+        </w:rPr>
+        <w:t>numero</w:t>
+      </w:r>
+      <w:proofErr w:type="spellEnd"/>
+      <w:r>
+        <w:rPr>
+          <w:b/>
+          <w:bCs/>
+          <w:color w:val="000000" w:themeColor="text1"/>
+          <w:spacing w:val="-2"/>
+          <w:sz w:val="26"/>
+          <w:szCs w:val="26"/>
+          <w:lang w:val="pt-BR"/>
+        </w:rPr>
+        <w:t xml:space="preserve"> e: %d", maior(x, y));</w:t>
+      </w:r>
+    </w:p>
+    <w:p>
+      <w:pPr>
+        <w:pStyle w:val="PargrafodaLista"/>
+        <w:tabs>
+          <w:tab w:val="left" w:pos="385"/>
+        </w:tabs>
+        <w:ind w:left="385"/>
+        <w:rPr>
+          <w:b/>
+          <w:bCs/>
+          <w:color w:val="000000" w:themeColor="text1"/>
+          <w:spacing w:val="-2"/>
+          <w:sz w:val="26"/>
+          <w:szCs w:val="26"/>
+          <w:lang w:val="pt-BR"/>
+        </w:rPr>
+      </w:pPr>
+    </w:p>
+    <w:p>
+      <w:pPr>
+        <w:pStyle w:val="PargrafodaLista"/>
+        <w:tabs>
+          <w:tab w:val="left" w:pos="385"/>
+        </w:tabs>
+        <w:ind w:left="385"/>
+        <w:rPr>
+          <w:b/>
+          <w:bCs/>
+          <w:color w:val="000000" w:themeColor="text1"/>
+          <w:spacing w:val="-2"/>
+          <w:sz w:val="26"/>
+          <w:szCs w:val="26"/>
+          <w:lang w:val="pt-BR"/>
+        </w:rPr>
+      </w:pPr>
+      <w:r>
+        <w:rPr>
+          <w:b/>
+          <w:bCs/>
+          <w:color w:val="000000" w:themeColor="text1"/>
+          <w:spacing w:val="-2"/>
+          <w:sz w:val="26"/>
+          <w:szCs w:val="26"/>
+          <w:lang w:val="pt-BR"/>
+        </w:rPr>
+        <w:tab/>
+      </w:r>
+      <w:r>
+        <w:rPr>
+          <w:b/>
+          <w:bCs/>
+          <w:color w:val="000000" w:themeColor="text1"/>
+          <w:spacing w:val="-2"/>
+          <w:sz w:val="26"/>
+          <w:szCs w:val="26"/>
+          <w:lang w:val="pt-BR"/>
+        </w:rPr>
+        <w:tab/>
+      </w:r>
+      <w:r>
+        <w:rPr>
+          <w:b/>
+          <w:bCs/>
+          <w:color w:val="000000" w:themeColor="text1"/>
+          <w:spacing w:val="-2"/>
+          <w:sz w:val="26"/>
+          <w:szCs w:val="26"/>
+          <w:lang w:val="pt-BR"/>
+        </w:rPr>
+        <w:t>}</w:t>
+      </w:r>
+    </w:p>
+    <w:p>
+      <w:pPr>
+        <w:pStyle w:val="PargrafodaLista"/>
+        <w:tabs>
+          <w:tab w:val="left" w:pos="385"/>
+        </w:tabs>
         <w:ind w:left="385" w:firstLine="0"/>
         <w:rPr>
           <w:b/>
@@ -6160,39 +7496,6 @@
           <w:szCs w:val="26"/>
         </w:rPr>
       </w:pPr>
-      <w:r>
-        <w:rPr>
-          <w:b/>
-          <w:bCs/>
-          <w:color w:val="000000" w:themeColor="text1"/>
-          <w:spacing w:val="-2"/>
-          <w:sz w:val="26"/>
-          <w:szCs w:val="26"/>
-        </w:rPr>
-        <w:t>int main(</w:t>
-      </w:r>
-      <w:r>
-        <w:rPr>
-          <w:b/>
-          <w:bCs/>
-          <w:color w:val="000000" w:themeColor="text1"/>
-          <w:spacing w:val="-2"/>
-          <w:sz w:val="26"/>
-          <w:szCs w:val="26"/>
-        </w:rPr>
-        <w:t xml:space="preserve"> </w:t>
-      </w:r>
-      <w:r>
-        <w:rPr>
-          <w:b/>
-          <w:bCs/>
-          <w:color w:val="000000" w:themeColor="text1"/>
-          <w:spacing w:val="-2"/>
-          <w:sz w:val="26"/>
-          <w:szCs w:val="26"/>
-        </w:rPr>
-        <w:t>)</w:t>
-      </w:r>
     </w:p>
     <w:p>
       <w:pPr>
@@ -6210,337 +7513,142 @@
           <w:szCs w:val="26"/>
         </w:rPr>
       </w:pPr>
-      <w:r>
-        <w:rPr>
-          <w:b/>
-          <w:bCs/>
-          <w:color w:val="000000" w:themeColor="text1"/>
-          <w:spacing w:val="-2"/>
-          <w:sz w:val="26"/>
-          <w:szCs w:val="26"/>
-        </w:rPr>
-        <w:t>{</w:t>
-      </w:r>
-    </w:p>
-    <w:p>
-      <w:pPr>
+    </w:p>
+    <w:p>
+      <w:pPr>
+        <w:pStyle w:val="PargrafodaLista"/>
         <w:tabs>
           <w:tab w:val="left" w:pos="385"/>
         </w:tabs>
-        <w:ind w:hanging="328"/>
-        <w:rPr>
-          <w:b/>
-          <w:bCs/>
-          <w:color w:val="000000" w:themeColor="text1"/>
-          <w:spacing w:val="-2"/>
-          <w:sz w:val="26"/>
-          <w:szCs w:val="26"/>
-        </w:rPr>
-      </w:pPr>
-      <w:r>
-        <w:rPr>
-          <w:b/>
-          <w:bCs/>
-          <w:color w:val="000000" w:themeColor="text1"/>
-          <w:spacing w:val="-2"/>
-          <w:sz w:val="26"/>
-          <w:szCs w:val="26"/>
-        </w:rPr>
-        <w:tab/>
-      </w:r>
-      <w:r>
-        <w:rPr>
-          <w:b/>
-          <w:bCs/>
-          <w:color w:val="000000" w:themeColor="text1"/>
-          <w:spacing w:val="-2"/>
-          <w:sz w:val="26"/>
-          <w:szCs w:val="26"/>
-        </w:rPr>
-        <w:tab/>
-      </w:r>
-      <w:r>
-        <w:rPr>
-          <w:b/>
-          <w:bCs/>
-          <w:color w:val="000000" w:themeColor="text1"/>
-          <w:spacing w:val="-2"/>
-          <w:sz w:val="26"/>
-          <w:szCs w:val="26"/>
-        </w:rPr>
-        <w:tab/>
-        <w:t>int resultado;</w:t>
-      </w:r>
-    </w:p>
-    <w:p>
-      <w:pPr>
+        <w:ind w:left="385" w:firstLine="0"/>
+        <w:rPr>
+          <w:b/>
+          <w:bCs/>
+          <w:color w:val="000000" w:themeColor="text1"/>
+          <w:spacing w:val="-2"/>
+          <w:sz w:val="26"/>
+          <w:szCs w:val="26"/>
+        </w:rPr>
+      </w:pPr>
+    </w:p>
+    <w:p>
+      <w:pPr>
+        <w:pStyle w:val="PargrafodaLista"/>
         <w:tabs>
           <w:tab w:val="left" w:pos="385"/>
         </w:tabs>
-        <w:ind w:hanging="328"/>
-        <w:rPr>
-          <w:b/>
-          <w:bCs/>
-          <w:color w:val="000000" w:themeColor="text1"/>
-          <w:spacing w:val="-2"/>
-          <w:sz w:val="26"/>
-          <w:szCs w:val="26"/>
-        </w:rPr>
-      </w:pPr>
-    </w:p>
-    <w:p>
-      <w:pPr>
+        <w:ind w:left="385" w:firstLine="0"/>
+        <w:rPr>
+          <w:b/>
+          <w:bCs/>
+          <w:color w:val="000000" w:themeColor="text1"/>
+          <w:spacing w:val="-2"/>
+          <w:sz w:val="26"/>
+          <w:szCs w:val="26"/>
+        </w:rPr>
+      </w:pPr>
+    </w:p>
+    <w:p>
+      <w:pPr>
+        <w:pStyle w:val="PargrafodaLista"/>
         <w:tabs>
           <w:tab w:val="left" w:pos="385"/>
         </w:tabs>
-        <w:ind w:hanging="328"/>
-        <w:rPr>
-          <w:b/>
-          <w:bCs/>
-          <w:color w:val="000000" w:themeColor="text1"/>
-          <w:spacing w:val="-2"/>
-          <w:sz w:val="26"/>
-          <w:szCs w:val="26"/>
-        </w:rPr>
-      </w:pPr>
-      <w:r>
-        <w:rPr>
-          <w:b/>
-          <w:bCs/>
-          <w:color w:val="000000" w:themeColor="text1"/>
-          <w:spacing w:val="-2"/>
-          <w:sz w:val="26"/>
-          <w:szCs w:val="26"/>
-        </w:rPr>
-        <w:tab/>
-      </w:r>
-      <w:r>
-        <w:rPr>
-          <w:b/>
-          <w:bCs/>
-          <w:color w:val="000000" w:themeColor="text1"/>
-          <w:spacing w:val="-2"/>
-          <w:sz w:val="26"/>
-          <w:szCs w:val="26"/>
-        </w:rPr>
-        <w:tab/>
-      </w:r>
-      <w:r>
-        <w:rPr>
-          <w:b/>
-          <w:bCs/>
-          <w:color w:val="000000" w:themeColor="text1"/>
-          <w:spacing w:val="-2"/>
-          <w:sz w:val="26"/>
-          <w:szCs w:val="26"/>
-        </w:rPr>
-        <w:tab/>
-        <w:t>printf(“Digite 2 numeros inteiros: “);</w:t>
-      </w:r>
-    </w:p>
-    <w:p>
-      <w:pPr>
+        <w:ind w:left="385" w:firstLine="0"/>
+        <w:rPr>
+          <w:b/>
+          <w:bCs/>
+          <w:color w:val="000000" w:themeColor="text1"/>
+          <w:spacing w:val="-2"/>
+          <w:sz w:val="26"/>
+          <w:szCs w:val="26"/>
+        </w:rPr>
+      </w:pPr>
+    </w:p>
+    <w:p>
+      <w:pPr>
+        <w:pStyle w:val="PargrafodaLista"/>
         <w:tabs>
           <w:tab w:val="left" w:pos="385"/>
         </w:tabs>
-        <w:ind w:hanging="328"/>
-        <w:rPr>
-          <w:b/>
-          <w:bCs/>
-          <w:color w:val="000000" w:themeColor="text1"/>
-          <w:spacing w:val="-2"/>
-          <w:sz w:val="26"/>
-          <w:szCs w:val="26"/>
-        </w:rPr>
-      </w:pPr>
-      <w:r>
-        <w:rPr>
-          <w:b/>
-          <w:bCs/>
-          <w:color w:val="000000" w:themeColor="text1"/>
-          <w:spacing w:val="-2"/>
-          <w:sz w:val="26"/>
-          <w:szCs w:val="26"/>
-        </w:rPr>
-        <w:tab/>
-      </w:r>
-      <w:r>
-        <w:rPr>
-          <w:b/>
-          <w:bCs/>
-          <w:color w:val="000000" w:themeColor="text1"/>
-          <w:spacing w:val="-2"/>
-          <w:sz w:val="26"/>
-          <w:szCs w:val="26"/>
-        </w:rPr>
-        <w:tab/>
-      </w:r>
-      <w:r>
-        <w:rPr>
-          <w:b/>
-          <w:bCs/>
-          <w:color w:val="000000" w:themeColor="text1"/>
-          <w:spacing w:val="-2"/>
-          <w:sz w:val="26"/>
-          <w:szCs w:val="26"/>
-        </w:rPr>
-        <w:tab/>
-        <w:t>scanf(“%d %d”, &amp;x, &amp;y);</w:t>
-      </w:r>
-    </w:p>
-    <w:p>
-      <w:pPr>
+        <w:ind w:left="385" w:firstLine="0"/>
+        <w:rPr>
+          <w:b/>
+          <w:bCs/>
+          <w:color w:val="000000" w:themeColor="text1"/>
+          <w:spacing w:val="-2"/>
+          <w:sz w:val="26"/>
+          <w:szCs w:val="26"/>
+        </w:rPr>
+      </w:pPr>
+    </w:p>
+    <w:p>
+      <w:pPr>
+        <w:pStyle w:val="PargrafodaLista"/>
         <w:tabs>
           <w:tab w:val="left" w:pos="385"/>
         </w:tabs>
-        <w:ind w:hanging="328"/>
-        <w:rPr>
-          <w:b/>
-          <w:bCs/>
-          <w:color w:val="000000" w:themeColor="text1"/>
-          <w:spacing w:val="-2"/>
-          <w:sz w:val="26"/>
-          <w:szCs w:val="26"/>
-        </w:rPr>
-      </w:pPr>
-    </w:p>
-    <w:p>
-      <w:pPr>
+        <w:ind w:left="385" w:firstLine="0"/>
+        <w:rPr>
+          <w:b/>
+          <w:bCs/>
+          <w:color w:val="000000" w:themeColor="text1"/>
+          <w:spacing w:val="-2"/>
+          <w:sz w:val="26"/>
+          <w:szCs w:val="26"/>
+        </w:rPr>
+      </w:pPr>
+    </w:p>
+    <w:p>
+      <w:pPr>
+        <w:pStyle w:val="PargrafodaLista"/>
         <w:tabs>
           <w:tab w:val="left" w:pos="385"/>
         </w:tabs>
-        <w:ind w:hanging="328"/>
-        <w:rPr>
-          <w:b/>
-          <w:bCs/>
-          <w:color w:val="000000" w:themeColor="text1"/>
-          <w:spacing w:val="-2"/>
-          <w:sz w:val="26"/>
-          <w:szCs w:val="26"/>
-        </w:rPr>
-      </w:pPr>
-      <w:r>
-        <w:rPr>
-          <w:b/>
-          <w:bCs/>
-          <w:color w:val="000000" w:themeColor="text1"/>
-          <w:spacing w:val="-2"/>
-          <w:sz w:val="26"/>
-          <w:szCs w:val="26"/>
-        </w:rPr>
-        <w:tab/>
-      </w:r>
-      <w:r>
-        <w:rPr>
-          <w:b/>
-          <w:bCs/>
-          <w:color w:val="000000" w:themeColor="text1"/>
-          <w:spacing w:val="-2"/>
-          <w:sz w:val="26"/>
-          <w:szCs w:val="26"/>
-        </w:rPr>
-        <w:tab/>
-      </w:r>
-      <w:r>
-        <w:rPr>
-          <w:b/>
-          <w:bCs/>
-          <w:color w:val="000000" w:themeColor="text1"/>
-          <w:spacing w:val="-2"/>
-          <w:sz w:val="26"/>
-          <w:szCs w:val="26"/>
-        </w:rPr>
-        <w:tab/>
-        <w:t>resultado = maior(x, y)</w:t>
-      </w:r>
-      <w:r>
-        <w:rPr>
-          <w:b/>
-          <w:bCs/>
-          <w:color w:val="000000" w:themeColor="text1"/>
-          <w:spacing w:val="-2"/>
-          <w:sz w:val="26"/>
-          <w:szCs w:val="26"/>
-        </w:rPr>
-        <w:t>)</w:t>
-      </w:r>
-      <w:r>
-        <w:rPr>
-          <w:b/>
-          <w:bCs/>
-          <w:color w:val="000000" w:themeColor="text1"/>
-          <w:spacing w:val="-2"/>
-          <w:sz w:val="26"/>
-          <w:szCs w:val="26"/>
-        </w:rPr>
-        <w:t>;</w:t>
-      </w:r>
-    </w:p>
-    <w:p>
-      <w:pPr>
+        <w:ind w:left="385" w:firstLine="0"/>
+        <w:rPr>
+          <w:b/>
+          <w:bCs/>
+          <w:color w:val="000000" w:themeColor="text1"/>
+          <w:spacing w:val="-2"/>
+          <w:sz w:val="26"/>
+          <w:szCs w:val="26"/>
+        </w:rPr>
+      </w:pPr>
+    </w:p>
+    <w:p>
+      <w:pPr>
+        <w:pStyle w:val="PargrafodaLista"/>
         <w:tabs>
           <w:tab w:val="left" w:pos="385"/>
         </w:tabs>
-        <w:ind w:hanging="328"/>
-        <w:rPr>
-          <w:b/>
-          <w:bCs/>
-          <w:color w:val="000000" w:themeColor="text1"/>
-          <w:spacing w:val="-2"/>
-          <w:sz w:val="26"/>
-          <w:szCs w:val="26"/>
-        </w:rPr>
-      </w:pPr>
-    </w:p>
-    <w:p>
-      <w:pPr>
+        <w:ind w:left="385" w:firstLine="0"/>
+        <w:rPr>
+          <w:b/>
+          <w:bCs/>
+          <w:color w:val="000000" w:themeColor="text1"/>
+          <w:spacing w:val="-2"/>
+          <w:sz w:val="26"/>
+          <w:szCs w:val="26"/>
+        </w:rPr>
+      </w:pPr>
+    </w:p>
+    <w:p>
+      <w:pPr>
+        <w:pStyle w:val="PargrafodaLista"/>
         <w:tabs>
           <w:tab w:val="left" w:pos="385"/>
         </w:tabs>
-        <w:ind w:hanging="328"/>
-        <w:rPr>
-          <w:b/>
-          <w:bCs/>
-          <w:color w:val="000000" w:themeColor="text1"/>
-          <w:spacing w:val="-2"/>
-          <w:sz w:val="26"/>
-          <w:szCs w:val="26"/>
-        </w:rPr>
-      </w:pPr>
-      <w:r>
-        <w:rPr>
-          <w:b/>
-          <w:bCs/>
-          <w:color w:val="000000" w:themeColor="text1"/>
-          <w:spacing w:val="-2"/>
-          <w:sz w:val="26"/>
-          <w:szCs w:val="26"/>
-        </w:rPr>
-        <w:tab/>
-      </w:r>
-      <w:r>
-        <w:rPr>
-          <w:b/>
-          <w:bCs/>
-          <w:color w:val="000000" w:themeColor="text1"/>
-          <w:spacing w:val="-2"/>
-          <w:sz w:val="26"/>
-          <w:szCs w:val="26"/>
-        </w:rPr>
-        <w:tab/>
-      </w:r>
-      <w:r>
-        <w:rPr>
-          <w:b/>
-          <w:bCs/>
-          <w:color w:val="000000" w:themeColor="text1"/>
-          <w:spacing w:val="-2"/>
-          <w:sz w:val="26"/>
-          <w:szCs w:val="26"/>
-        </w:rPr>
-        <w:tab/>
-        <w:t>printf(resultado);</w:t>
-      </w:r>
+        <w:ind w:left="385" w:firstLine="0"/>
+        <w:rPr>
+          <w:b/>
+          <w:bCs/>
+          <w:color w:val="000000" w:themeColor="text1"/>
+          <w:spacing w:val="-2"/>
+          <w:sz w:val="26"/>
+          <w:szCs w:val="26"/>
+        </w:rPr>
+      </w:pPr>
     </w:p>
     <w:p>
       <w:pPr>
@@ -6558,377 +7666,19 @@
           <w:szCs w:val="26"/>
         </w:rPr>
       </w:pPr>
-      <w:r>
-        <w:rPr>
-          <w:b/>
-          <w:bCs/>
-          <w:color w:val="000000" w:themeColor="text1"/>
-          <w:spacing w:val="-2"/>
-          <w:sz w:val="26"/>
-          <w:szCs w:val="26"/>
-        </w:rPr>
-        <w:t>}</w:t>
-      </w:r>
-    </w:p>
-    <w:p>
-      <w:pPr>
-        <w:pStyle w:val="PargrafodaLista"/>
-        <w:tabs>
-          <w:tab w:val="left" w:pos="385"/>
-        </w:tabs>
-        <w:ind w:left="385" w:firstLine="0"/>
-        <w:rPr>
-          <w:b/>
-          <w:bCs/>
-          <w:color w:val="000000" w:themeColor="text1"/>
-          <w:spacing w:val="-2"/>
-          <w:sz w:val="26"/>
-          <w:szCs w:val="26"/>
-        </w:rPr>
-      </w:pPr>
-    </w:p>
-    <w:p>
-      <w:pPr>
-        <w:pStyle w:val="PargrafodaLista"/>
-        <w:tabs>
-          <w:tab w:val="left" w:pos="385"/>
-        </w:tabs>
-        <w:ind w:left="385" w:firstLine="0"/>
-        <w:rPr>
-          <w:b/>
-          <w:bCs/>
-          <w:color w:val="000000" w:themeColor="text1"/>
-          <w:spacing w:val="-2"/>
-          <w:sz w:val="26"/>
-          <w:szCs w:val="26"/>
-        </w:rPr>
-      </w:pPr>
-    </w:p>
-    <w:p>
-      <w:pPr>
-        <w:pStyle w:val="PargrafodaLista"/>
-        <w:tabs>
-          <w:tab w:val="left" w:pos="385"/>
-        </w:tabs>
-        <w:ind w:left="385" w:firstLine="0"/>
-        <w:rPr>
-          <w:b/>
-          <w:bCs/>
-          <w:color w:val="000000" w:themeColor="text1"/>
-          <w:spacing w:val="-2"/>
-          <w:sz w:val="26"/>
-          <w:szCs w:val="26"/>
-        </w:rPr>
-      </w:pPr>
-    </w:p>
-    <w:p>
-      <w:pPr>
-        <w:pStyle w:val="PargrafodaLista"/>
-        <w:tabs>
-          <w:tab w:val="left" w:pos="385"/>
-        </w:tabs>
-        <w:ind w:left="385" w:firstLine="0"/>
-        <w:rPr>
-          <w:b/>
-          <w:bCs/>
-          <w:color w:val="000000" w:themeColor="text1"/>
-          <w:spacing w:val="-2"/>
-          <w:sz w:val="26"/>
-          <w:szCs w:val="26"/>
-        </w:rPr>
-      </w:pPr>
-    </w:p>
-    <w:p>
-      <w:pPr>
-        <w:pStyle w:val="PargrafodaLista"/>
-        <w:tabs>
-          <w:tab w:val="left" w:pos="385"/>
-        </w:tabs>
-        <w:ind w:left="385" w:firstLine="0"/>
-        <w:rPr>
-          <w:b/>
-          <w:bCs/>
-          <w:color w:val="000000" w:themeColor="text1"/>
-          <w:spacing w:val="-2"/>
-          <w:sz w:val="26"/>
-          <w:szCs w:val="26"/>
-        </w:rPr>
-      </w:pPr>
-    </w:p>
-    <w:p>
-      <w:pPr>
-        <w:pStyle w:val="PargrafodaLista"/>
-        <w:tabs>
-          <w:tab w:val="left" w:pos="385"/>
-        </w:tabs>
-        <w:ind w:left="385" w:firstLine="0"/>
-        <w:rPr>
-          <w:b/>
-          <w:bCs/>
-          <w:color w:val="000000" w:themeColor="text1"/>
-          <w:spacing w:val="-2"/>
-          <w:sz w:val="26"/>
-          <w:szCs w:val="26"/>
-        </w:rPr>
-      </w:pPr>
-    </w:p>
-    <w:p>
-      <w:pPr>
-        <w:pStyle w:val="PargrafodaLista"/>
-        <w:tabs>
-          <w:tab w:val="left" w:pos="385"/>
-        </w:tabs>
-        <w:ind w:left="385" w:firstLine="0"/>
-        <w:rPr>
-          <w:b/>
-          <w:bCs/>
-          <w:color w:val="000000" w:themeColor="text1"/>
-          <w:spacing w:val="-2"/>
-          <w:sz w:val="26"/>
-          <w:szCs w:val="26"/>
-        </w:rPr>
-      </w:pPr>
-    </w:p>
-    <w:p>
-      <w:pPr>
-        <w:pStyle w:val="PargrafodaLista"/>
-        <w:tabs>
-          <w:tab w:val="left" w:pos="385"/>
-        </w:tabs>
-        <w:ind w:left="385" w:firstLine="0"/>
-        <w:rPr>
-          <w:b/>
-          <w:bCs/>
-          <w:color w:val="000000" w:themeColor="text1"/>
-          <w:spacing w:val="-2"/>
-          <w:sz w:val="26"/>
-          <w:szCs w:val="26"/>
-        </w:rPr>
-      </w:pPr>
-    </w:p>
-    <w:p>
-      <w:pPr>
-        <w:pStyle w:val="PargrafodaLista"/>
-        <w:tabs>
-          <w:tab w:val="left" w:pos="385"/>
-        </w:tabs>
-        <w:ind w:left="385" w:firstLine="0"/>
-        <w:rPr>
-          <w:b/>
-          <w:bCs/>
-          <w:color w:val="000000" w:themeColor="text1"/>
-          <w:spacing w:val="-2"/>
-          <w:sz w:val="26"/>
-          <w:szCs w:val="26"/>
-        </w:rPr>
-      </w:pPr>
-    </w:p>
-    <w:p>
-      <w:pPr>
-        <w:pStyle w:val="PargrafodaLista"/>
-        <w:tabs>
-          <w:tab w:val="left" w:pos="385"/>
-        </w:tabs>
-        <w:ind w:left="385" w:firstLine="0"/>
-        <w:rPr>
-          <w:b/>
-          <w:bCs/>
-          <w:color w:val="000000" w:themeColor="text1"/>
-          <w:spacing w:val="-2"/>
-          <w:sz w:val="26"/>
-          <w:szCs w:val="26"/>
-        </w:rPr>
-      </w:pPr>
-    </w:p>
-    <w:p>
-      <w:pPr>
-        <w:pStyle w:val="PargrafodaLista"/>
-        <w:tabs>
-          <w:tab w:val="left" w:pos="385"/>
-        </w:tabs>
-        <w:ind w:left="385" w:firstLine="0"/>
-        <w:rPr>
-          <w:b/>
-          <w:bCs/>
-          <w:color w:val="000000" w:themeColor="text1"/>
-          <w:spacing w:val="-2"/>
-          <w:sz w:val="26"/>
-          <w:szCs w:val="26"/>
-        </w:rPr>
-      </w:pPr>
-    </w:p>
-    <w:p>
-      <w:pPr>
-        <w:pStyle w:val="PargrafodaLista"/>
-        <w:tabs>
-          <w:tab w:val="left" w:pos="385"/>
-        </w:tabs>
-        <w:ind w:left="385" w:firstLine="0"/>
-        <w:rPr>
-          <w:b/>
-          <w:bCs/>
-          <w:color w:val="000000" w:themeColor="text1"/>
-          <w:spacing w:val="-2"/>
-          <w:sz w:val="26"/>
-          <w:szCs w:val="26"/>
-        </w:rPr>
-      </w:pPr>
-    </w:p>
-    <w:p>
-      <w:pPr>
-        <w:pStyle w:val="PargrafodaLista"/>
-        <w:tabs>
-          <w:tab w:val="left" w:pos="385"/>
-        </w:tabs>
-        <w:ind w:left="385" w:firstLine="0"/>
-        <w:rPr>
-          <w:b/>
-          <w:bCs/>
-          <w:color w:val="000000" w:themeColor="text1"/>
-          <w:spacing w:val="-2"/>
-          <w:sz w:val="26"/>
-          <w:szCs w:val="26"/>
-        </w:rPr>
-      </w:pPr>
-    </w:p>
-    <w:p>
-      <w:pPr>
-        <w:pStyle w:val="PargrafodaLista"/>
-        <w:tabs>
-          <w:tab w:val="left" w:pos="385"/>
-        </w:tabs>
-        <w:ind w:left="385" w:firstLine="0"/>
-        <w:rPr>
-          <w:b/>
-          <w:bCs/>
-          <w:color w:val="000000" w:themeColor="text1"/>
-          <w:spacing w:val="-2"/>
-          <w:sz w:val="26"/>
-          <w:szCs w:val="26"/>
-        </w:rPr>
-      </w:pPr>
-    </w:p>
-    <w:p>
-      <w:pPr>
-        <w:pStyle w:val="PargrafodaLista"/>
-        <w:tabs>
-          <w:tab w:val="left" w:pos="385"/>
-        </w:tabs>
-        <w:ind w:left="385" w:firstLine="0"/>
-        <w:rPr>
-          <w:b/>
-          <w:bCs/>
-          <w:color w:val="000000" w:themeColor="text1"/>
-          <w:spacing w:val="-2"/>
-          <w:sz w:val="26"/>
-          <w:szCs w:val="26"/>
-        </w:rPr>
-      </w:pPr>
-    </w:p>
-    <w:p>
-      <w:pPr>
-        <w:pStyle w:val="PargrafodaLista"/>
-        <w:tabs>
-          <w:tab w:val="left" w:pos="385"/>
-        </w:tabs>
-        <w:ind w:left="385" w:firstLine="0"/>
-        <w:rPr>
-          <w:b/>
-          <w:bCs/>
-          <w:color w:val="000000" w:themeColor="text1"/>
-          <w:spacing w:val="-2"/>
-          <w:sz w:val="26"/>
-          <w:szCs w:val="26"/>
-        </w:rPr>
-      </w:pPr>
-    </w:p>
-    <w:p>
-      <w:pPr>
-        <w:pStyle w:val="PargrafodaLista"/>
-        <w:tabs>
-          <w:tab w:val="left" w:pos="385"/>
-        </w:tabs>
-        <w:ind w:left="385" w:firstLine="0"/>
-        <w:rPr>
-          <w:b/>
-          <w:bCs/>
-          <w:color w:val="000000" w:themeColor="text1"/>
-          <w:spacing w:val="-2"/>
-          <w:sz w:val="26"/>
-          <w:szCs w:val="26"/>
-        </w:rPr>
-      </w:pPr>
-    </w:p>
-    <w:p>
-      <w:pPr>
-        <w:pStyle w:val="PargrafodaLista"/>
-        <w:tabs>
-          <w:tab w:val="left" w:pos="385"/>
-        </w:tabs>
-        <w:ind w:left="385" w:firstLine="0"/>
-        <w:rPr>
-          <w:b/>
-          <w:bCs/>
-          <w:color w:val="000000" w:themeColor="text1"/>
-          <w:spacing w:val="-2"/>
-          <w:sz w:val="26"/>
-          <w:szCs w:val="26"/>
-        </w:rPr>
-      </w:pPr>
-    </w:p>
-    <w:p>
-      <w:pPr>
-        <w:pStyle w:val="PargrafodaLista"/>
-        <w:tabs>
-          <w:tab w:val="left" w:pos="385"/>
-        </w:tabs>
-        <w:ind w:left="385" w:firstLine="0"/>
-        <w:rPr>
-          <w:b/>
-          <w:bCs/>
-          <w:color w:val="000000" w:themeColor="text1"/>
-          <w:spacing w:val="-2"/>
-          <w:sz w:val="26"/>
-          <w:szCs w:val="26"/>
-        </w:rPr>
-      </w:pPr>
-    </w:p>
-    <w:p>
-      <w:pPr>
-        <w:pStyle w:val="PargrafodaLista"/>
-        <w:tabs>
-          <w:tab w:val="left" w:pos="385"/>
-        </w:tabs>
-        <w:ind w:left="385" w:firstLine="0"/>
-        <w:rPr>
-          <w:b/>
-          <w:bCs/>
-          <w:color w:val="000000" w:themeColor="text1"/>
-          <w:spacing w:val="-2"/>
-          <w:sz w:val="26"/>
-          <w:szCs w:val="26"/>
-        </w:rPr>
-      </w:pPr>
-    </w:p>
-    <w:p>
-      <w:pPr>
-        <w:pStyle w:val="PargrafodaLista"/>
-        <w:tabs>
-          <w:tab w:val="left" w:pos="385"/>
-        </w:tabs>
-        <w:ind w:left="385" w:firstLine="0"/>
-        <w:rPr>
-          <w:b/>
-          <w:bCs/>
-          <w:color w:val="000000" w:themeColor="text1"/>
-          <w:sz w:val="26"/>
-          <w:szCs w:val="26"/>
-        </w:rPr>
-      </w:pPr>
-    </w:p>
-    <w:p>
-      <w:pPr>
-        <w:ind w:left="125"/>
+    </w:p>
+    <w:p>
+      <w:pPr>
+        <w:rPr>
+          <w:b/>
+          <w:bCs/>
+          <w:color w:val="7030A0"/>
+          <w:sz w:val="20"/>
+        </w:rPr>
+      </w:pPr>
+    </w:p>
+    <w:p>
+      <w:pPr>
         <w:rPr>
           <w:b/>
           <w:bCs/>
@@ -6959,6 +7709,7 @@
         <w:rPr>
           <w:color w:val="333333"/>
         </w:rPr>
+        <w:lastRenderedPageBreak/>
         <w:t>Uma</w:t>
       </w:r>
       <w:r>
@@ -8318,6 +9069,390 @@
         </w:rPr>
         <w:t>}</w:t>
       </w:r>
+    </w:p>
+    <w:p>
+      <w:pPr>
+        <w:pStyle w:val="PargrafodaLista"/>
+        <w:tabs>
+          <w:tab w:val="left" w:pos="385"/>
+        </w:tabs>
+        <w:ind w:left="385"/>
+        <w:rPr>
+          <w:b/>
+          <w:bCs/>
+          <w:sz w:val="26"/>
+          <w:szCs w:val="26"/>
+          <w:lang w:val="pt-BR"/>
+        </w:rPr>
+      </w:pPr>
+    </w:p>
+    <w:p>
+      <w:pPr>
+        <w:pStyle w:val="PargrafodaLista"/>
+        <w:tabs>
+          <w:tab w:val="left" w:pos="385"/>
+        </w:tabs>
+        <w:ind w:left="385"/>
+        <w:rPr>
+          <w:b/>
+          <w:bCs/>
+          <w:sz w:val="26"/>
+          <w:szCs w:val="26"/>
+          <w:lang w:val="pt-BR"/>
+        </w:rPr>
+      </w:pPr>
+    </w:p>
+    <w:p>
+      <w:pPr>
+        <w:pStyle w:val="PargrafodaLista"/>
+        <w:tabs>
+          <w:tab w:val="left" w:pos="385"/>
+        </w:tabs>
+        <w:ind w:left="385"/>
+        <w:rPr>
+          <w:b/>
+          <w:bCs/>
+          <w:sz w:val="26"/>
+          <w:szCs w:val="26"/>
+          <w:lang w:val="pt-BR"/>
+        </w:rPr>
+      </w:pPr>
+    </w:p>
+    <w:p>
+      <w:pPr>
+        <w:pStyle w:val="PargrafodaLista"/>
+        <w:tabs>
+          <w:tab w:val="left" w:pos="385"/>
+        </w:tabs>
+        <w:ind w:left="385"/>
+        <w:rPr>
+          <w:b/>
+          <w:bCs/>
+          <w:sz w:val="26"/>
+          <w:szCs w:val="26"/>
+          <w:lang w:val="pt-BR"/>
+        </w:rPr>
+      </w:pPr>
+    </w:p>
+    <w:p>
+      <w:pPr>
+        <w:pStyle w:val="PargrafodaLista"/>
+        <w:tabs>
+          <w:tab w:val="left" w:pos="385"/>
+        </w:tabs>
+        <w:ind w:left="385"/>
+        <w:rPr>
+          <w:b/>
+          <w:bCs/>
+          <w:sz w:val="26"/>
+          <w:szCs w:val="26"/>
+          <w:lang w:val="pt-BR"/>
+        </w:rPr>
+      </w:pPr>
+    </w:p>
+    <w:p>
+      <w:pPr>
+        <w:pStyle w:val="PargrafodaLista"/>
+        <w:tabs>
+          <w:tab w:val="left" w:pos="385"/>
+        </w:tabs>
+        <w:ind w:left="385"/>
+        <w:rPr>
+          <w:b/>
+          <w:bCs/>
+          <w:sz w:val="26"/>
+          <w:szCs w:val="26"/>
+          <w:lang w:val="pt-BR"/>
+        </w:rPr>
+      </w:pPr>
+    </w:p>
+    <w:p>
+      <w:pPr>
+        <w:pStyle w:val="PargrafodaLista"/>
+        <w:tabs>
+          <w:tab w:val="left" w:pos="385"/>
+        </w:tabs>
+        <w:ind w:left="385"/>
+        <w:rPr>
+          <w:b/>
+          <w:bCs/>
+          <w:sz w:val="26"/>
+          <w:szCs w:val="26"/>
+          <w:lang w:val="pt-BR"/>
+        </w:rPr>
+      </w:pPr>
+    </w:p>
+    <w:p>
+      <w:pPr>
+        <w:pStyle w:val="PargrafodaLista"/>
+        <w:tabs>
+          <w:tab w:val="left" w:pos="385"/>
+        </w:tabs>
+        <w:ind w:left="385"/>
+        <w:rPr>
+          <w:b/>
+          <w:bCs/>
+          <w:sz w:val="26"/>
+          <w:szCs w:val="26"/>
+          <w:lang w:val="pt-BR"/>
+        </w:rPr>
+      </w:pPr>
+    </w:p>
+    <w:p>
+      <w:pPr>
+        <w:pStyle w:val="PargrafodaLista"/>
+        <w:tabs>
+          <w:tab w:val="left" w:pos="385"/>
+        </w:tabs>
+        <w:ind w:left="385"/>
+        <w:rPr>
+          <w:b/>
+          <w:bCs/>
+          <w:sz w:val="26"/>
+          <w:szCs w:val="26"/>
+          <w:lang w:val="pt-BR"/>
+        </w:rPr>
+      </w:pPr>
+    </w:p>
+    <w:p>
+      <w:pPr>
+        <w:pStyle w:val="PargrafodaLista"/>
+        <w:tabs>
+          <w:tab w:val="left" w:pos="385"/>
+        </w:tabs>
+        <w:ind w:left="385"/>
+        <w:rPr>
+          <w:b/>
+          <w:bCs/>
+          <w:sz w:val="26"/>
+          <w:szCs w:val="26"/>
+          <w:lang w:val="pt-BR"/>
+        </w:rPr>
+      </w:pPr>
+    </w:p>
+    <w:p>
+      <w:pPr>
+        <w:pStyle w:val="PargrafodaLista"/>
+        <w:tabs>
+          <w:tab w:val="left" w:pos="385"/>
+        </w:tabs>
+        <w:ind w:left="385"/>
+        <w:rPr>
+          <w:b/>
+          <w:bCs/>
+          <w:sz w:val="26"/>
+          <w:szCs w:val="26"/>
+          <w:lang w:val="pt-BR"/>
+        </w:rPr>
+      </w:pPr>
+    </w:p>
+    <w:p>
+      <w:pPr>
+        <w:pStyle w:val="PargrafodaLista"/>
+        <w:tabs>
+          <w:tab w:val="left" w:pos="385"/>
+        </w:tabs>
+        <w:ind w:left="385"/>
+        <w:rPr>
+          <w:b/>
+          <w:bCs/>
+          <w:sz w:val="26"/>
+          <w:szCs w:val="26"/>
+          <w:lang w:val="pt-BR"/>
+        </w:rPr>
+      </w:pPr>
+    </w:p>
+    <w:p>
+      <w:pPr>
+        <w:pStyle w:val="PargrafodaLista"/>
+        <w:tabs>
+          <w:tab w:val="left" w:pos="385"/>
+        </w:tabs>
+        <w:ind w:left="385"/>
+        <w:rPr>
+          <w:b/>
+          <w:bCs/>
+          <w:sz w:val="26"/>
+          <w:szCs w:val="26"/>
+          <w:lang w:val="pt-BR"/>
+        </w:rPr>
+      </w:pPr>
+    </w:p>
+    <w:p>
+      <w:pPr>
+        <w:pStyle w:val="PargrafodaLista"/>
+        <w:tabs>
+          <w:tab w:val="left" w:pos="385"/>
+        </w:tabs>
+        <w:ind w:left="385"/>
+        <w:rPr>
+          <w:b/>
+          <w:bCs/>
+          <w:sz w:val="26"/>
+          <w:szCs w:val="26"/>
+          <w:lang w:val="pt-BR"/>
+        </w:rPr>
+      </w:pPr>
+    </w:p>
+    <w:p>
+      <w:pPr>
+        <w:pStyle w:val="PargrafodaLista"/>
+        <w:tabs>
+          <w:tab w:val="left" w:pos="385"/>
+        </w:tabs>
+        <w:ind w:left="385"/>
+        <w:rPr>
+          <w:b/>
+          <w:bCs/>
+          <w:sz w:val="26"/>
+          <w:szCs w:val="26"/>
+          <w:lang w:val="pt-BR"/>
+        </w:rPr>
+      </w:pPr>
+    </w:p>
+    <w:p>
+      <w:pPr>
+        <w:pStyle w:val="PargrafodaLista"/>
+        <w:tabs>
+          <w:tab w:val="left" w:pos="385"/>
+        </w:tabs>
+        <w:ind w:left="385"/>
+        <w:rPr>
+          <w:b/>
+          <w:bCs/>
+          <w:sz w:val="26"/>
+          <w:szCs w:val="26"/>
+          <w:lang w:val="pt-BR"/>
+        </w:rPr>
+      </w:pPr>
+    </w:p>
+    <w:p>
+      <w:pPr>
+        <w:pStyle w:val="PargrafodaLista"/>
+        <w:tabs>
+          <w:tab w:val="left" w:pos="385"/>
+        </w:tabs>
+        <w:ind w:left="385"/>
+        <w:rPr>
+          <w:b/>
+          <w:bCs/>
+          <w:sz w:val="26"/>
+          <w:szCs w:val="26"/>
+          <w:lang w:val="pt-BR"/>
+        </w:rPr>
+      </w:pPr>
+    </w:p>
+    <w:p>
+      <w:pPr>
+        <w:pStyle w:val="PargrafodaLista"/>
+        <w:tabs>
+          <w:tab w:val="left" w:pos="385"/>
+        </w:tabs>
+        <w:ind w:left="385"/>
+        <w:rPr>
+          <w:b/>
+          <w:bCs/>
+          <w:sz w:val="26"/>
+          <w:szCs w:val="26"/>
+          <w:lang w:val="pt-BR"/>
+        </w:rPr>
+      </w:pPr>
+    </w:p>
+    <w:p>
+      <w:pPr>
+        <w:pStyle w:val="PargrafodaLista"/>
+        <w:tabs>
+          <w:tab w:val="left" w:pos="385"/>
+        </w:tabs>
+        <w:ind w:left="385"/>
+        <w:rPr>
+          <w:b/>
+          <w:bCs/>
+          <w:sz w:val="26"/>
+          <w:szCs w:val="26"/>
+          <w:lang w:val="pt-BR"/>
+        </w:rPr>
+      </w:pPr>
+    </w:p>
+    <w:p>
+      <w:pPr>
+        <w:pStyle w:val="PargrafodaLista"/>
+        <w:tabs>
+          <w:tab w:val="left" w:pos="385"/>
+        </w:tabs>
+        <w:ind w:left="385"/>
+        <w:rPr>
+          <w:b/>
+          <w:bCs/>
+          <w:sz w:val="26"/>
+          <w:szCs w:val="26"/>
+          <w:lang w:val="pt-BR"/>
+        </w:rPr>
+      </w:pPr>
+    </w:p>
+    <w:p>
+      <w:pPr>
+        <w:pStyle w:val="PargrafodaLista"/>
+        <w:tabs>
+          <w:tab w:val="left" w:pos="385"/>
+        </w:tabs>
+        <w:ind w:left="385"/>
+        <w:rPr>
+          <w:b/>
+          <w:bCs/>
+          <w:sz w:val="26"/>
+          <w:szCs w:val="26"/>
+          <w:lang w:val="pt-BR"/>
+        </w:rPr>
+      </w:pPr>
+    </w:p>
+    <w:p>
+      <w:pPr>
+        <w:pStyle w:val="PargrafodaLista"/>
+        <w:tabs>
+          <w:tab w:val="left" w:pos="385"/>
+        </w:tabs>
+        <w:ind w:left="385"/>
+        <w:rPr>
+          <w:b/>
+          <w:bCs/>
+          <w:sz w:val="26"/>
+          <w:szCs w:val="26"/>
+          <w:lang w:val="pt-BR"/>
+        </w:rPr>
+      </w:pPr>
+    </w:p>
+    <w:p>
+      <w:pPr>
+        <w:pStyle w:val="PargrafodaLista"/>
+        <w:tabs>
+          <w:tab w:val="left" w:pos="385"/>
+        </w:tabs>
+        <w:ind w:left="385"/>
+        <w:rPr>
+          <w:b/>
+          <w:bCs/>
+          <w:sz w:val="26"/>
+          <w:szCs w:val="26"/>
+          <w:lang w:val="pt-BR"/>
+        </w:rPr>
+      </w:pPr>
+    </w:p>
+    <w:p>
+      <w:pPr>
+        <w:pStyle w:val="PargrafodaLista"/>
+        <w:tabs>
+          <w:tab w:val="left" w:pos="385"/>
+        </w:tabs>
+        <w:ind w:left="385"/>
+        <w:rPr>
+          <w:b/>
+          <w:bCs/>
+          <w:sz w:val="26"/>
+          <w:szCs w:val="26"/>
+          <w:lang w:val="pt-BR"/>
+        </w:rPr>
+      </w:pPr>
       <w:r>
         <w:rPr>
           <w:noProof/>
@@ -8397,7 +9532,7 @@
           </mc:Choice>
           <mc:Fallback>
             <w:pict>
-              <v:shape w14:anchorId="0D61C331" id="Graphic 17" o:spid="_x0000_s1026" style="position:absolute;margin-left:61.6pt;margin-top:126.25pt;width:472.3pt;height:.5pt;z-index:-251656192;visibility:visible;mso-wrap-style:square;mso-wrap-distance-left:0;mso-wrap-distance-top:0;mso-wrap-distance-right:0;mso-wrap-distance-bottom:0;mso-position-horizontal:absolute;mso-position-horizontal-relative:page;mso-position-vertical:absolute;mso-position-vertical-relative:text;v-text-anchor:top" coordsize="5998210,6350" o:gfxdata="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" path="m5997829,l,,,6096r5997829,l5997829,xe" fillcolor="#ddd" stroked="f">
+              <v:shape w14:anchorId="4AD53FAD" id="Graphic 17" o:spid="_x0000_s1026" style="position:absolute;margin-left:61.6pt;margin-top:126.25pt;width:472.3pt;height:.5pt;z-index:-251656192;visibility:visible;mso-wrap-style:square;mso-wrap-distance-left:0;mso-wrap-distance-top:0;mso-wrap-distance-right:0;mso-wrap-distance-bottom:0;mso-position-horizontal:absolute;mso-position-horizontal-relative:page;mso-position-vertical:absolute;mso-position-vertical-relative:text;v-text-anchor:top" coordsize="5998210,6350" o:gfxdata="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" path="m5997829,l,,,6096r5997829,l5997829,xe" fillcolor="#ddd" stroked="f">
                 <v:path arrowok="t"/>
                 <w10:wrap type="topAndBottom" anchorx="page"/>
               </v:shape>
@@ -8418,6 +9553,7 @@
           <w:color w:val="1A5EA8"/>
           <w:sz w:val="24"/>
         </w:rPr>
+        <w:lastRenderedPageBreak/>
         <w:t>Questão</w:t>
       </w:r>
       <w:r>
@@ -9125,6 +10261,1702 @@
           <w:spacing w:val="-2"/>
         </w:rPr>
         <w:t>reprovado)</w:t>
+      </w:r>
+    </w:p>
+    <w:p>
+      <w:pPr>
+        <w:tabs>
+          <w:tab w:val="left" w:pos="328"/>
+        </w:tabs>
+        <w:spacing w:before="40"/>
+        <w:rPr>
+          <w:lang w:val="pt-BR"/>
+        </w:rPr>
+      </w:pPr>
+    </w:p>
+    <w:p>
+      <w:pPr>
+        <w:tabs>
+          <w:tab w:val="left" w:pos="328"/>
+        </w:tabs>
+        <w:spacing w:before="40"/>
+        <w:rPr>
+          <w:sz w:val="16"/>
+          <w:szCs w:val="16"/>
+          <w:lang w:val="pt-BR"/>
+        </w:rPr>
+      </w:pPr>
+      <w:r>
+        <w:rPr>
+          <w:sz w:val="16"/>
+          <w:szCs w:val="16"/>
+          <w:lang w:val="pt-BR"/>
+        </w:rPr>
+        <w:t>#include &lt;</w:t>
+      </w:r>
+      <w:proofErr w:type="spellStart"/>
+      <w:r>
+        <w:rPr>
+          <w:sz w:val="16"/>
+          <w:szCs w:val="16"/>
+          <w:lang w:val="pt-BR"/>
+        </w:rPr>
+        <w:t>stdio.h</w:t>
+      </w:r>
+      <w:proofErr w:type="spellEnd"/>
+      <w:r>
+        <w:rPr>
+          <w:sz w:val="16"/>
+          <w:szCs w:val="16"/>
+          <w:lang w:val="pt-BR"/>
+        </w:rPr>
+        <w:t>&gt;</w:t>
+      </w:r>
+    </w:p>
+    <w:p>
+      <w:pPr>
+        <w:tabs>
+          <w:tab w:val="left" w:pos="328"/>
+        </w:tabs>
+        <w:spacing w:before="40"/>
+        <w:rPr>
+          <w:sz w:val="16"/>
+          <w:szCs w:val="16"/>
+          <w:lang w:val="pt-BR"/>
+        </w:rPr>
+      </w:pPr>
+    </w:p>
+    <w:p>
+      <w:pPr>
+        <w:tabs>
+          <w:tab w:val="left" w:pos="328"/>
+        </w:tabs>
+        <w:spacing w:before="40"/>
+        <w:rPr>
+          <w:sz w:val="16"/>
+          <w:szCs w:val="16"/>
+          <w:lang w:val="pt-BR"/>
+        </w:rPr>
+      </w:pPr>
+      <w:r>
+        <w:rPr>
+          <w:sz w:val="16"/>
+          <w:szCs w:val="16"/>
+          <w:lang w:val="pt-BR"/>
+        </w:rPr>
+        <w:t>// FUNÇÃO PARA CALCULAR A MÉDIA:</w:t>
+      </w:r>
+    </w:p>
+    <w:p>
+      <w:pPr>
+        <w:tabs>
+          <w:tab w:val="left" w:pos="328"/>
+        </w:tabs>
+        <w:spacing w:before="40"/>
+        <w:rPr>
+          <w:sz w:val="16"/>
+          <w:szCs w:val="16"/>
+          <w:lang w:val="pt-BR"/>
+        </w:rPr>
+      </w:pPr>
+    </w:p>
+    <w:p>
+      <w:pPr>
+        <w:tabs>
+          <w:tab w:val="left" w:pos="328"/>
+        </w:tabs>
+        <w:spacing w:before="40"/>
+        <w:rPr>
+          <w:sz w:val="16"/>
+          <w:szCs w:val="16"/>
+          <w:lang w:val="pt-BR"/>
+        </w:rPr>
+      </w:pPr>
+      <w:proofErr w:type="spellStart"/>
+      <w:r>
+        <w:rPr>
+          <w:sz w:val="16"/>
+          <w:szCs w:val="16"/>
+          <w:lang w:val="pt-BR"/>
+        </w:rPr>
+        <w:t>float</w:t>
+      </w:r>
+      <w:proofErr w:type="spellEnd"/>
+      <w:r>
+        <w:rPr>
+          <w:sz w:val="16"/>
+          <w:szCs w:val="16"/>
+          <w:lang w:val="pt-BR"/>
+        </w:rPr>
+        <w:t xml:space="preserve"> </w:t>
+      </w:r>
+      <w:proofErr w:type="spellStart"/>
+      <w:proofErr w:type="gramStart"/>
+      <w:r>
+        <w:rPr>
+          <w:sz w:val="16"/>
+          <w:szCs w:val="16"/>
+          <w:lang w:val="pt-BR"/>
+        </w:rPr>
+        <w:t>calculaMedia</w:t>
+      </w:r>
+      <w:proofErr w:type="spellEnd"/>
+      <w:r>
+        <w:rPr>
+          <w:sz w:val="16"/>
+          <w:szCs w:val="16"/>
+          <w:lang w:val="pt-BR"/>
+        </w:rPr>
+        <w:t>(</w:t>
+      </w:r>
+      <w:proofErr w:type="spellStart"/>
+      <w:proofErr w:type="gramEnd"/>
+      <w:r>
+        <w:rPr>
+          <w:sz w:val="16"/>
+          <w:szCs w:val="16"/>
+          <w:lang w:val="pt-BR"/>
+        </w:rPr>
+        <w:t>int</w:t>
+      </w:r>
+      <w:proofErr w:type="spellEnd"/>
+      <w:r>
+        <w:rPr>
+          <w:sz w:val="16"/>
+          <w:szCs w:val="16"/>
+          <w:lang w:val="pt-BR"/>
+        </w:rPr>
+        <w:t xml:space="preserve"> n1, </w:t>
+      </w:r>
+      <w:proofErr w:type="spellStart"/>
+      <w:r>
+        <w:rPr>
+          <w:sz w:val="16"/>
+          <w:szCs w:val="16"/>
+          <w:lang w:val="pt-BR"/>
+        </w:rPr>
+        <w:t>int</w:t>
+      </w:r>
+      <w:proofErr w:type="spellEnd"/>
+      <w:r>
+        <w:rPr>
+          <w:sz w:val="16"/>
+          <w:szCs w:val="16"/>
+          <w:lang w:val="pt-BR"/>
+        </w:rPr>
+        <w:t xml:space="preserve"> n2, </w:t>
+      </w:r>
+      <w:proofErr w:type="spellStart"/>
+      <w:r>
+        <w:rPr>
+          <w:sz w:val="16"/>
+          <w:szCs w:val="16"/>
+          <w:lang w:val="pt-BR"/>
+        </w:rPr>
+        <w:t>int</w:t>
+      </w:r>
+      <w:proofErr w:type="spellEnd"/>
+      <w:r>
+        <w:rPr>
+          <w:sz w:val="16"/>
+          <w:szCs w:val="16"/>
+          <w:lang w:val="pt-BR"/>
+        </w:rPr>
+        <w:t xml:space="preserve"> n3)</w:t>
+      </w:r>
+    </w:p>
+    <w:p>
+      <w:pPr>
+        <w:tabs>
+          <w:tab w:val="left" w:pos="328"/>
+        </w:tabs>
+        <w:spacing w:before="40"/>
+        <w:rPr>
+          <w:sz w:val="16"/>
+          <w:szCs w:val="16"/>
+          <w:lang w:val="pt-BR"/>
+        </w:rPr>
+      </w:pPr>
+      <w:r>
+        <w:rPr>
+          <w:sz w:val="16"/>
+          <w:szCs w:val="16"/>
+          <w:lang w:val="pt-BR"/>
+        </w:rPr>
+        <w:t>{</w:t>
+      </w:r>
+    </w:p>
+    <w:p>
+      <w:pPr>
+        <w:tabs>
+          <w:tab w:val="left" w:pos="328"/>
+        </w:tabs>
+        <w:spacing w:before="40"/>
+        <w:rPr>
+          <w:sz w:val="16"/>
+          <w:szCs w:val="16"/>
+          <w:lang w:val="pt-BR"/>
+        </w:rPr>
+      </w:pPr>
+      <w:r>
+        <w:rPr>
+          <w:sz w:val="16"/>
+          <w:szCs w:val="16"/>
+          <w:lang w:val="pt-BR"/>
+        </w:rPr>
+        <w:t xml:space="preserve">    </w:t>
+      </w:r>
+      <w:proofErr w:type="spellStart"/>
+      <w:r>
+        <w:rPr>
+          <w:sz w:val="16"/>
+          <w:szCs w:val="16"/>
+          <w:lang w:val="pt-BR"/>
+        </w:rPr>
+        <w:t>return</w:t>
+      </w:r>
+      <w:proofErr w:type="spellEnd"/>
+      <w:r>
+        <w:rPr>
+          <w:sz w:val="16"/>
+          <w:szCs w:val="16"/>
+          <w:lang w:val="pt-BR"/>
+        </w:rPr>
+        <w:t xml:space="preserve"> (n1 + n2 + n3) / 3;</w:t>
+      </w:r>
+    </w:p>
+    <w:p>
+      <w:pPr>
+        <w:tabs>
+          <w:tab w:val="left" w:pos="328"/>
+        </w:tabs>
+        <w:spacing w:before="40"/>
+        <w:rPr>
+          <w:sz w:val="16"/>
+          <w:szCs w:val="16"/>
+          <w:lang w:val="pt-BR"/>
+        </w:rPr>
+      </w:pPr>
+      <w:r>
+        <w:rPr>
+          <w:sz w:val="16"/>
+          <w:szCs w:val="16"/>
+          <w:lang w:val="pt-BR"/>
+        </w:rPr>
+        <w:t>}</w:t>
+      </w:r>
+    </w:p>
+    <w:p>
+      <w:pPr>
+        <w:tabs>
+          <w:tab w:val="left" w:pos="328"/>
+        </w:tabs>
+        <w:spacing w:before="40"/>
+        <w:rPr>
+          <w:sz w:val="16"/>
+          <w:szCs w:val="16"/>
+          <w:lang w:val="pt-BR"/>
+        </w:rPr>
+      </w:pPr>
+    </w:p>
+    <w:p>
+      <w:pPr>
+        <w:tabs>
+          <w:tab w:val="left" w:pos="328"/>
+        </w:tabs>
+        <w:spacing w:before="40"/>
+        <w:rPr>
+          <w:sz w:val="16"/>
+          <w:szCs w:val="16"/>
+          <w:lang w:val="pt-BR"/>
+        </w:rPr>
+      </w:pPr>
+      <w:r>
+        <w:rPr>
+          <w:sz w:val="16"/>
+          <w:szCs w:val="16"/>
+          <w:lang w:val="pt-BR"/>
+        </w:rPr>
+        <w:t>// FUNÇÃO PARA MOSTRAR O RESULTADO;</w:t>
+      </w:r>
+    </w:p>
+    <w:p>
+      <w:pPr>
+        <w:tabs>
+          <w:tab w:val="left" w:pos="328"/>
+        </w:tabs>
+        <w:spacing w:before="40"/>
+        <w:rPr>
+          <w:sz w:val="16"/>
+          <w:szCs w:val="16"/>
+          <w:lang w:val="pt-BR"/>
+        </w:rPr>
+      </w:pPr>
+    </w:p>
+    <w:p>
+      <w:pPr>
+        <w:tabs>
+          <w:tab w:val="left" w:pos="328"/>
+        </w:tabs>
+        <w:spacing w:before="40"/>
+        <w:rPr>
+          <w:sz w:val="16"/>
+          <w:szCs w:val="16"/>
+          <w:lang w:val="pt-BR"/>
+        </w:rPr>
+      </w:pPr>
+      <w:r>
+        <w:rPr>
+          <w:sz w:val="16"/>
+          <w:szCs w:val="16"/>
+          <w:lang w:val="pt-BR"/>
+        </w:rPr>
+        <w:t xml:space="preserve">char </w:t>
+      </w:r>
+      <w:proofErr w:type="spellStart"/>
+      <w:proofErr w:type="gramStart"/>
+      <w:r>
+        <w:rPr>
+          <w:sz w:val="16"/>
+          <w:szCs w:val="16"/>
+          <w:lang w:val="pt-BR"/>
+        </w:rPr>
+        <w:t>exibirResultado</w:t>
+      </w:r>
+      <w:proofErr w:type="spellEnd"/>
+      <w:r>
+        <w:rPr>
+          <w:sz w:val="16"/>
+          <w:szCs w:val="16"/>
+          <w:lang w:val="pt-BR"/>
+        </w:rPr>
+        <w:t>(</w:t>
+      </w:r>
+      <w:proofErr w:type="spellStart"/>
+      <w:proofErr w:type="gramEnd"/>
+      <w:r>
+        <w:rPr>
+          <w:sz w:val="16"/>
+          <w:szCs w:val="16"/>
+          <w:lang w:val="pt-BR"/>
+        </w:rPr>
+        <w:t>float</w:t>
+      </w:r>
+      <w:proofErr w:type="spellEnd"/>
+      <w:r>
+        <w:rPr>
+          <w:sz w:val="16"/>
+          <w:szCs w:val="16"/>
+          <w:lang w:val="pt-BR"/>
+        </w:rPr>
+        <w:t xml:space="preserve"> media)</w:t>
+      </w:r>
+    </w:p>
+    <w:p>
+      <w:pPr>
+        <w:tabs>
+          <w:tab w:val="left" w:pos="328"/>
+        </w:tabs>
+        <w:spacing w:before="40"/>
+        <w:rPr>
+          <w:sz w:val="16"/>
+          <w:szCs w:val="16"/>
+          <w:lang w:val="pt-BR"/>
+        </w:rPr>
+      </w:pPr>
+      <w:r>
+        <w:rPr>
+          <w:sz w:val="16"/>
+          <w:szCs w:val="16"/>
+          <w:lang w:val="pt-BR"/>
+        </w:rPr>
+        <w:t>{</w:t>
+      </w:r>
+    </w:p>
+    <w:p>
+      <w:pPr>
+        <w:tabs>
+          <w:tab w:val="left" w:pos="328"/>
+        </w:tabs>
+        <w:spacing w:before="40"/>
+        <w:rPr>
+          <w:sz w:val="16"/>
+          <w:szCs w:val="16"/>
+          <w:lang w:val="pt-BR"/>
+        </w:rPr>
+      </w:pPr>
+      <w:r>
+        <w:rPr>
+          <w:sz w:val="16"/>
+          <w:szCs w:val="16"/>
+          <w:lang w:val="pt-BR"/>
+        </w:rPr>
+        <w:t xml:space="preserve">    </w:t>
+      </w:r>
+      <w:proofErr w:type="spellStart"/>
+      <w:r>
+        <w:rPr>
+          <w:sz w:val="16"/>
+          <w:szCs w:val="16"/>
+          <w:lang w:val="pt-BR"/>
+        </w:rPr>
+        <w:t>if</w:t>
+      </w:r>
+      <w:proofErr w:type="spellEnd"/>
+      <w:r>
+        <w:rPr>
+          <w:sz w:val="16"/>
+          <w:szCs w:val="16"/>
+          <w:lang w:val="pt-BR"/>
+        </w:rPr>
+        <w:t xml:space="preserve"> (media &lt; 5)</w:t>
+      </w:r>
+    </w:p>
+    <w:p>
+      <w:pPr>
+        <w:tabs>
+          <w:tab w:val="left" w:pos="328"/>
+        </w:tabs>
+        <w:spacing w:before="40"/>
+        <w:rPr>
+          <w:sz w:val="16"/>
+          <w:szCs w:val="16"/>
+          <w:lang w:val="pt-BR"/>
+        </w:rPr>
+      </w:pPr>
+    </w:p>
+    <w:p>
+      <w:pPr>
+        <w:tabs>
+          <w:tab w:val="left" w:pos="328"/>
+        </w:tabs>
+        <w:spacing w:before="40"/>
+        <w:rPr>
+          <w:sz w:val="16"/>
+          <w:szCs w:val="16"/>
+          <w:lang w:val="pt-BR"/>
+        </w:rPr>
+      </w:pPr>
+      <w:r>
+        <w:rPr>
+          <w:sz w:val="16"/>
+          <w:szCs w:val="16"/>
+          <w:lang w:val="pt-BR"/>
+        </w:rPr>
+        <w:t xml:space="preserve">        </w:t>
+      </w:r>
+      <w:proofErr w:type="spellStart"/>
+      <w:r>
+        <w:rPr>
+          <w:sz w:val="16"/>
+          <w:szCs w:val="16"/>
+          <w:lang w:val="pt-BR"/>
+        </w:rPr>
+        <w:t>return</w:t>
+      </w:r>
+      <w:proofErr w:type="spellEnd"/>
+      <w:r>
+        <w:rPr>
+          <w:sz w:val="16"/>
+          <w:szCs w:val="16"/>
+          <w:lang w:val="pt-BR"/>
+        </w:rPr>
+        <w:t xml:space="preserve"> </w:t>
+      </w:r>
+      <w:proofErr w:type="spellStart"/>
+      <w:proofErr w:type="gramStart"/>
+      <w:r>
+        <w:rPr>
+          <w:sz w:val="16"/>
+          <w:szCs w:val="16"/>
+          <w:lang w:val="pt-BR"/>
+        </w:rPr>
+        <w:t>printf</w:t>
+      </w:r>
+      <w:proofErr w:type="spellEnd"/>
+      <w:r>
+        <w:rPr>
+          <w:sz w:val="16"/>
+          <w:szCs w:val="16"/>
+          <w:lang w:val="pt-BR"/>
+        </w:rPr>
+        <w:t>(</w:t>
+      </w:r>
+      <w:proofErr w:type="gramEnd"/>
+      <w:r>
+        <w:rPr>
+          <w:sz w:val="16"/>
+          <w:szCs w:val="16"/>
+          <w:lang w:val="pt-BR"/>
+        </w:rPr>
+        <w:t>"O ALUNO ESTA REPROVADO !!!");</w:t>
+      </w:r>
+    </w:p>
+    <w:p>
+      <w:pPr>
+        <w:tabs>
+          <w:tab w:val="left" w:pos="328"/>
+        </w:tabs>
+        <w:spacing w:before="40"/>
+        <w:rPr>
+          <w:sz w:val="16"/>
+          <w:szCs w:val="16"/>
+          <w:lang w:val="pt-BR"/>
+        </w:rPr>
+      </w:pPr>
+    </w:p>
+    <w:p>
+      <w:pPr>
+        <w:tabs>
+          <w:tab w:val="left" w:pos="328"/>
+        </w:tabs>
+        <w:spacing w:before="40"/>
+        <w:rPr>
+          <w:sz w:val="16"/>
+          <w:szCs w:val="16"/>
+          <w:lang w:val="pt-BR"/>
+        </w:rPr>
+      </w:pPr>
+      <w:r>
+        <w:rPr>
+          <w:sz w:val="16"/>
+          <w:szCs w:val="16"/>
+          <w:lang w:val="pt-BR"/>
+        </w:rPr>
+        <w:t xml:space="preserve">    </w:t>
+      </w:r>
+      <w:proofErr w:type="spellStart"/>
+      <w:r>
+        <w:rPr>
+          <w:sz w:val="16"/>
+          <w:szCs w:val="16"/>
+          <w:lang w:val="pt-BR"/>
+        </w:rPr>
+        <w:t>if</w:t>
+      </w:r>
+      <w:proofErr w:type="spellEnd"/>
+      <w:r>
+        <w:rPr>
+          <w:sz w:val="16"/>
+          <w:szCs w:val="16"/>
+          <w:lang w:val="pt-BR"/>
+        </w:rPr>
+        <w:t xml:space="preserve"> (media &gt;=5 &amp;&amp; media &lt;= 7) </w:t>
+      </w:r>
+    </w:p>
+    <w:p>
+      <w:pPr>
+        <w:tabs>
+          <w:tab w:val="left" w:pos="328"/>
+        </w:tabs>
+        <w:spacing w:before="40"/>
+        <w:rPr>
+          <w:sz w:val="16"/>
+          <w:szCs w:val="16"/>
+          <w:lang w:val="pt-BR"/>
+        </w:rPr>
+      </w:pPr>
+    </w:p>
+    <w:p>
+      <w:pPr>
+        <w:tabs>
+          <w:tab w:val="left" w:pos="328"/>
+        </w:tabs>
+        <w:spacing w:before="40"/>
+        <w:rPr>
+          <w:sz w:val="16"/>
+          <w:szCs w:val="16"/>
+          <w:lang w:val="pt-BR"/>
+        </w:rPr>
+      </w:pPr>
+      <w:r>
+        <w:rPr>
+          <w:sz w:val="16"/>
+          <w:szCs w:val="16"/>
+          <w:lang w:val="pt-BR"/>
+        </w:rPr>
+        <w:t xml:space="preserve">        </w:t>
+      </w:r>
+      <w:proofErr w:type="spellStart"/>
+      <w:r>
+        <w:rPr>
+          <w:sz w:val="16"/>
+          <w:szCs w:val="16"/>
+          <w:lang w:val="pt-BR"/>
+        </w:rPr>
+        <w:t>return</w:t>
+      </w:r>
+      <w:proofErr w:type="spellEnd"/>
+      <w:r>
+        <w:rPr>
+          <w:sz w:val="16"/>
+          <w:szCs w:val="16"/>
+          <w:lang w:val="pt-BR"/>
+        </w:rPr>
+        <w:t xml:space="preserve"> </w:t>
+      </w:r>
+      <w:proofErr w:type="spellStart"/>
+      <w:proofErr w:type="gramStart"/>
+      <w:r>
+        <w:rPr>
+          <w:sz w:val="16"/>
+          <w:szCs w:val="16"/>
+          <w:lang w:val="pt-BR"/>
+        </w:rPr>
+        <w:t>printf</w:t>
+      </w:r>
+      <w:proofErr w:type="spellEnd"/>
+      <w:r>
+        <w:rPr>
+          <w:sz w:val="16"/>
+          <w:szCs w:val="16"/>
+          <w:lang w:val="pt-BR"/>
+        </w:rPr>
+        <w:t>(</w:t>
+      </w:r>
+      <w:proofErr w:type="gramEnd"/>
+      <w:r>
+        <w:rPr>
+          <w:sz w:val="16"/>
+          <w:szCs w:val="16"/>
+          <w:lang w:val="pt-BR"/>
+        </w:rPr>
+        <w:t>"O ALUNO ESTA NA MEDIA !!!");</w:t>
+      </w:r>
+    </w:p>
+    <w:p>
+      <w:pPr>
+        <w:tabs>
+          <w:tab w:val="left" w:pos="328"/>
+        </w:tabs>
+        <w:spacing w:before="40"/>
+        <w:rPr>
+          <w:sz w:val="16"/>
+          <w:szCs w:val="16"/>
+          <w:lang w:val="pt-BR"/>
+        </w:rPr>
+      </w:pPr>
+    </w:p>
+    <w:p>
+      <w:pPr>
+        <w:tabs>
+          <w:tab w:val="left" w:pos="328"/>
+        </w:tabs>
+        <w:spacing w:before="40"/>
+        <w:rPr>
+          <w:sz w:val="16"/>
+          <w:szCs w:val="16"/>
+          <w:lang w:val="pt-BR"/>
+        </w:rPr>
+      </w:pPr>
+      <w:r>
+        <w:rPr>
+          <w:sz w:val="16"/>
+          <w:szCs w:val="16"/>
+          <w:lang w:val="pt-BR"/>
+        </w:rPr>
+        <w:t xml:space="preserve">    </w:t>
+      </w:r>
+      <w:proofErr w:type="spellStart"/>
+      <w:r>
+        <w:rPr>
+          <w:sz w:val="16"/>
+          <w:szCs w:val="16"/>
+          <w:lang w:val="pt-BR"/>
+        </w:rPr>
+        <w:t>else</w:t>
+      </w:r>
+      <w:proofErr w:type="spellEnd"/>
+    </w:p>
+    <w:p>
+      <w:pPr>
+        <w:tabs>
+          <w:tab w:val="left" w:pos="328"/>
+        </w:tabs>
+        <w:spacing w:before="40"/>
+        <w:rPr>
+          <w:sz w:val="16"/>
+          <w:szCs w:val="16"/>
+          <w:lang w:val="pt-BR"/>
+        </w:rPr>
+      </w:pPr>
+      <w:r>
+        <w:rPr>
+          <w:sz w:val="16"/>
+          <w:szCs w:val="16"/>
+          <w:lang w:val="pt-BR"/>
+        </w:rPr>
+        <w:t xml:space="preserve">        </w:t>
+      </w:r>
+      <w:proofErr w:type="spellStart"/>
+      <w:r>
+        <w:rPr>
+          <w:sz w:val="16"/>
+          <w:szCs w:val="16"/>
+          <w:lang w:val="pt-BR"/>
+        </w:rPr>
+        <w:t>return</w:t>
+      </w:r>
+      <w:proofErr w:type="spellEnd"/>
+      <w:r>
+        <w:rPr>
+          <w:sz w:val="16"/>
+          <w:szCs w:val="16"/>
+          <w:lang w:val="pt-BR"/>
+        </w:rPr>
+        <w:t xml:space="preserve"> </w:t>
+      </w:r>
+      <w:proofErr w:type="spellStart"/>
+      <w:proofErr w:type="gramStart"/>
+      <w:r>
+        <w:rPr>
+          <w:sz w:val="16"/>
+          <w:szCs w:val="16"/>
+          <w:lang w:val="pt-BR"/>
+        </w:rPr>
+        <w:t>printf</w:t>
+      </w:r>
+      <w:proofErr w:type="spellEnd"/>
+      <w:r>
+        <w:rPr>
+          <w:sz w:val="16"/>
+          <w:szCs w:val="16"/>
+          <w:lang w:val="pt-BR"/>
+        </w:rPr>
+        <w:t>(</w:t>
+      </w:r>
+      <w:proofErr w:type="gramEnd"/>
+      <w:r>
+        <w:rPr>
+          <w:sz w:val="16"/>
+          <w:szCs w:val="16"/>
+          <w:lang w:val="pt-BR"/>
+        </w:rPr>
+        <w:t>"O ALUNO ESTA APROVADO !!!");</w:t>
+      </w:r>
+    </w:p>
+    <w:p>
+      <w:pPr>
+        <w:tabs>
+          <w:tab w:val="left" w:pos="328"/>
+        </w:tabs>
+        <w:spacing w:before="40"/>
+        <w:rPr>
+          <w:sz w:val="16"/>
+          <w:szCs w:val="16"/>
+          <w:lang w:val="pt-BR"/>
+        </w:rPr>
+      </w:pPr>
+    </w:p>
+    <w:p>
+      <w:pPr>
+        <w:tabs>
+          <w:tab w:val="left" w:pos="328"/>
+        </w:tabs>
+        <w:spacing w:before="40"/>
+        <w:rPr>
+          <w:sz w:val="16"/>
+          <w:szCs w:val="16"/>
+          <w:lang w:val="pt-BR"/>
+        </w:rPr>
+      </w:pPr>
+      <w:r>
+        <w:rPr>
+          <w:sz w:val="16"/>
+          <w:szCs w:val="16"/>
+          <w:lang w:val="pt-BR"/>
+        </w:rPr>
+        <w:t>}</w:t>
+      </w:r>
+    </w:p>
+    <w:p>
+      <w:pPr>
+        <w:tabs>
+          <w:tab w:val="left" w:pos="328"/>
+        </w:tabs>
+        <w:spacing w:before="40"/>
+        <w:rPr>
+          <w:sz w:val="16"/>
+          <w:szCs w:val="16"/>
+          <w:lang w:val="pt-BR"/>
+        </w:rPr>
+      </w:pPr>
+    </w:p>
+    <w:p>
+      <w:pPr>
+        <w:tabs>
+          <w:tab w:val="left" w:pos="328"/>
+        </w:tabs>
+        <w:spacing w:before="40"/>
+        <w:rPr>
+          <w:sz w:val="16"/>
+          <w:szCs w:val="16"/>
+          <w:lang w:val="pt-BR"/>
+        </w:rPr>
+      </w:pPr>
+      <w:r>
+        <w:rPr>
+          <w:sz w:val="16"/>
+          <w:szCs w:val="16"/>
+          <w:lang w:val="pt-BR"/>
+        </w:rPr>
+        <w:t xml:space="preserve">// MAIN, CONTEÚDO PRINCIPAL </w:t>
+      </w:r>
+    </w:p>
+    <w:p>
+      <w:pPr>
+        <w:tabs>
+          <w:tab w:val="left" w:pos="328"/>
+        </w:tabs>
+        <w:spacing w:before="40"/>
+        <w:rPr>
+          <w:sz w:val="16"/>
+          <w:szCs w:val="16"/>
+          <w:lang w:val="pt-BR"/>
+        </w:rPr>
+      </w:pPr>
+    </w:p>
+    <w:p>
+      <w:pPr>
+        <w:tabs>
+          <w:tab w:val="left" w:pos="328"/>
+        </w:tabs>
+        <w:spacing w:before="40"/>
+        <w:rPr>
+          <w:sz w:val="16"/>
+          <w:szCs w:val="16"/>
+          <w:lang w:val="pt-BR"/>
+        </w:rPr>
+      </w:pPr>
+      <w:proofErr w:type="spellStart"/>
+      <w:r>
+        <w:rPr>
+          <w:sz w:val="16"/>
+          <w:szCs w:val="16"/>
+          <w:lang w:val="pt-BR"/>
+        </w:rPr>
+        <w:t>void</w:t>
+      </w:r>
+      <w:proofErr w:type="spellEnd"/>
+      <w:r>
+        <w:rPr>
+          <w:sz w:val="16"/>
+          <w:szCs w:val="16"/>
+          <w:lang w:val="pt-BR"/>
+        </w:rPr>
+        <w:t xml:space="preserve"> </w:t>
+      </w:r>
+      <w:proofErr w:type="spellStart"/>
+      <w:proofErr w:type="gramStart"/>
+      <w:r>
+        <w:rPr>
+          <w:sz w:val="16"/>
+          <w:szCs w:val="16"/>
+          <w:lang w:val="pt-BR"/>
+        </w:rPr>
+        <w:t>main</w:t>
+      </w:r>
+      <w:proofErr w:type="spellEnd"/>
+      <w:r>
+        <w:rPr>
+          <w:sz w:val="16"/>
+          <w:szCs w:val="16"/>
+          <w:lang w:val="pt-BR"/>
+        </w:rPr>
+        <w:t>(</w:t>
+      </w:r>
+      <w:proofErr w:type="gramEnd"/>
+      <w:r>
+        <w:rPr>
+          <w:sz w:val="16"/>
+          <w:szCs w:val="16"/>
+          <w:lang w:val="pt-BR"/>
+        </w:rPr>
+        <w:t>)</w:t>
+      </w:r>
+    </w:p>
+    <w:p>
+      <w:pPr>
+        <w:tabs>
+          <w:tab w:val="left" w:pos="328"/>
+        </w:tabs>
+        <w:spacing w:before="40"/>
+        <w:rPr>
+          <w:sz w:val="16"/>
+          <w:szCs w:val="16"/>
+          <w:lang w:val="pt-BR"/>
+        </w:rPr>
+      </w:pPr>
+      <w:r>
+        <w:rPr>
+          <w:sz w:val="16"/>
+          <w:szCs w:val="16"/>
+          <w:lang w:val="pt-BR"/>
+        </w:rPr>
+        <w:t>{</w:t>
+      </w:r>
+    </w:p>
+    <w:p>
+      <w:pPr>
+        <w:tabs>
+          <w:tab w:val="left" w:pos="328"/>
+        </w:tabs>
+        <w:spacing w:before="40"/>
+        <w:rPr>
+          <w:sz w:val="16"/>
+          <w:szCs w:val="16"/>
+          <w:lang w:val="pt-BR"/>
+        </w:rPr>
+      </w:pPr>
+    </w:p>
+    <w:p>
+      <w:pPr>
+        <w:tabs>
+          <w:tab w:val="left" w:pos="328"/>
+        </w:tabs>
+        <w:spacing w:before="40"/>
+        <w:rPr>
+          <w:sz w:val="16"/>
+          <w:szCs w:val="16"/>
+          <w:lang w:val="pt-BR"/>
+        </w:rPr>
+      </w:pPr>
+      <w:r>
+        <w:rPr>
+          <w:sz w:val="16"/>
+          <w:szCs w:val="16"/>
+          <w:lang w:val="pt-BR"/>
+        </w:rPr>
+        <w:t xml:space="preserve">    </w:t>
+      </w:r>
+      <w:proofErr w:type="spellStart"/>
+      <w:r>
+        <w:rPr>
+          <w:sz w:val="16"/>
+          <w:szCs w:val="16"/>
+          <w:lang w:val="pt-BR"/>
+        </w:rPr>
+        <w:t>int</w:t>
+      </w:r>
+      <w:proofErr w:type="spellEnd"/>
+      <w:r>
+        <w:rPr>
+          <w:sz w:val="16"/>
+          <w:szCs w:val="16"/>
+          <w:lang w:val="pt-BR"/>
+        </w:rPr>
+        <w:t xml:space="preserve"> a = 0; </w:t>
+      </w:r>
+      <w:proofErr w:type="spellStart"/>
+      <w:r>
+        <w:rPr>
+          <w:sz w:val="16"/>
+          <w:szCs w:val="16"/>
+          <w:lang w:val="pt-BR"/>
+        </w:rPr>
+        <w:t>int</w:t>
+      </w:r>
+      <w:proofErr w:type="spellEnd"/>
+      <w:r>
+        <w:rPr>
+          <w:sz w:val="16"/>
+          <w:szCs w:val="16"/>
+          <w:lang w:val="pt-BR"/>
+        </w:rPr>
+        <w:t xml:space="preserve"> b = 0; </w:t>
+      </w:r>
+      <w:proofErr w:type="spellStart"/>
+      <w:r>
+        <w:rPr>
+          <w:sz w:val="16"/>
+          <w:szCs w:val="16"/>
+          <w:lang w:val="pt-BR"/>
+        </w:rPr>
+        <w:t>int</w:t>
+      </w:r>
+      <w:proofErr w:type="spellEnd"/>
+      <w:r>
+        <w:rPr>
+          <w:sz w:val="16"/>
+          <w:szCs w:val="16"/>
+          <w:lang w:val="pt-BR"/>
+        </w:rPr>
+        <w:t xml:space="preserve"> c = 0; </w:t>
+      </w:r>
+      <w:proofErr w:type="spellStart"/>
+      <w:r>
+        <w:rPr>
+          <w:sz w:val="16"/>
+          <w:szCs w:val="16"/>
+          <w:lang w:val="pt-BR"/>
+        </w:rPr>
+        <w:t>float</w:t>
+      </w:r>
+      <w:proofErr w:type="spellEnd"/>
+      <w:r>
+        <w:rPr>
+          <w:sz w:val="16"/>
+          <w:szCs w:val="16"/>
+          <w:lang w:val="pt-BR"/>
+        </w:rPr>
+        <w:t xml:space="preserve"> media = 0; char resultado;</w:t>
+      </w:r>
+    </w:p>
+    <w:p>
+      <w:pPr>
+        <w:tabs>
+          <w:tab w:val="left" w:pos="328"/>
+        </w:tabs>
+        <w:spacing w:before="40"/>
+        <w:rPr>
+          <w:sz w:val="16"/>
+          <w:szCs w:val="16"/>
+          <w:lang w:val="pt-BR"/>
+        </w:rPr>
+      </w:pPr>
+    </w:p>
+    <w:p>
+      <w:pPr>
+        <w:tabs>
+          <w:tab w:val="left" w:pos="328"/>
+        </w:tabs>
+        <w:spacing w:before="40"/>
+        <w:rPr>
+          <w:sz w:val="16"/>
+          <w:szCs w:val="16"/>
+          <w:lang w:val="pt-BR"/>
+        </w:rPr>
+      </w:pPr>
+      <w:r>
+        <w:rPr>
+          <w:sz w:val="16"/>
+          <w:szCs w:val="16"/>
+          <w:lang w:val="pt-BR"/>
+        </w:rPr>
+        <w:t xml:space="preserve">    </w:t>
+      </w:r>
+      <w:proofErr w:type="spellStart"/>
+      <w:proofErr w:type="gramStart"/>
+      <w:r>
+        <w:rPr>
+          <w:sz w:val="16"/>
+          <w:szCs w:val="16"/>
+          <w:lang w:val="pt-BR"/>
+        </w:rPr>
+        <w:t>printf</w:t>
+      </w:r>
+      <w:proofErr w:type="spellEnd"/>
+      <w:r>
+        <w:rPr>
+          <w:sz w:val="16"/>
+          <w:szCs w:val="16"/>
+          <w:lang w:val="pt-BR"/>
+        </w:rPr>
+        <w:t>(</w:t>
+      </w:r>
+      <w:proofErr w:type="gramEnd"/>
+      <w:r>
+        <w:rPr>
+          <w:sz w:val="16"/>
+          <w:szCs w:val="16"/>
+          <w:lang w:val="pt-BR"/>
+        </w:rPr>
+        <w:t>"VAMOS CALCULAR SUA MEDIA !!!\n\n");</w:t>
+      </w:r>
+    </w:p>
+    <w:p>
+      <w:pPr>
+        <w:tabs>
+          <w:tab w:val="left" w:pos="328"/>
+        </w:tabs>
+        <w:spacing w:before="40"/>
+        <w:rPr>
+          <w:sz w:val="16"/>
+          <w:szCs w:val="16"/>
+          <w:lang w:val="pt-BR"/>
+        </w:rPr>
+      </w:pPr>
+    </w:p>
+    <w:p>
+      <w:pPr>
+        <w:tabs>
+          <w:tab w:val="left" w:pos="328"/>
+        </w:tabs>
+        <w:spacing w:before="40"/>
+        <w:rPr>
+          <w:sz w:val="16"/>
+          <w:szCs w:val="16"/>
+          <w:lang w:val="pt-BR"/>
+        </w:rPr>
+      </w:pPr>
+      <w:r>
+        <w:rPr>
+          <w:sz w:val="16"/>
+          <w:szCs w:val="16"/>
+          <w:lang w:val="pt-BR"/>
+        </w:rPr>
+        <w:t xml:space="preserve">    </w:t>
+      </w:r>
+      <w:proofErr w:type="spellStart"/>
+      <w:proofErr w:type="gramStart"/>
+      <w:r>
+        <w:rPr>
+          <w:sz w:val="16"/>
+          <w:szCs w:val="16"/>
+          <w:lang w:val="pt-BR"/>
+        </w:rPr>
+        <w:t>printf</w:t>
+      </w:r>
+      <w:proofErr w:type="spellEnd"/>
+      <w:r>
+        <w:rPr>
+          <w:sz w:val="16"/>
+          <w:szCs w:val="16"/>
+          <w:lang w:val="pt-BR"/>
+        </w:rPr>
+        <w:t>(</w:t>
+      </w:r>
+      <w:proofErr w:type="gramEnd"/>
+      <w:r>
+        <w:rPr>
+          <w:sz w:val="16"/>
+          <w:szCs w:val="16"/>
+          <w:lang w:val="pt-BR"/>
+        </w:rPr>
+        <w:t>"Digite a primeira nota ");</w:t>
+      </w:r>
+    </w:p>
+    <w:p>
+      <w:pPr>
+        <w:tabs>
+          <w:tab w:val="left" w:pos="328"/>
+        </w:tabs>
+        <w:spacing w:before="40"/>
+        <w:rPr>
+          <w:sz w:val="16"/>
+          <w:szCs w:val="16"/>
+          <w:lang w:val="pt-BR"/>
+        </w:rPr>
+      </w:pPr>
+      <w:r>
+        <w:rPr>
+          <w:sz w:val="16"/>
+          <w:szCs w:val="16"/>
+          <w:lang w:val="pt-BR"/>
+        </w:rPr>
+        <w:t xml:space="preserve">    </w:t>
+      </w:r>
+      <w:proofErr w:type="spellStart"/>
+      <w:proofErr w:type="gramStart"/>
+      <w:r>
+        <w:rPr>
+          <w:sz w:val="16"/>
+          <w:szCs w:val="16"/>
+          <w:lang w:val="pt-BR"/>
+        </w:rPr>
+        <w:t>scanf</w:t>
+      </w:r>
+      <w:proofErr w:type="spellEnd"/>
+      <w:r>
+        <w:rPr>
+          <w:sz w:val="16"/>
+          <w:szCs w:val="16"/>
+          <w:lang w:val="pt-BR"/>
+        </w:rPr>
+        <w:t>(</w:t>
+      </w:r>
+      <w:proofErr w:type="gramEnd"/>
+      <w:r>
+        <w:rPr>
+          <w:sz w:val="16"/>
+          <w:szCs w:val="16"/>
+          <w:lang w:val="pt-BR"/>
+        </w:rPr>
+        <w:t>"%d", &amp;a);</w:t>
+      </w:r>
+    </w:p>
+    <w:p>
+      <w:pPr>
+        <w:tabs>
+          <w:tab w:val="left" w:pos="328"/>
+        </w:tabs>
+        <w:spacing w:before="40"/>
+        <w:rPr>
+          <w:sz w:val="16"/>
+          <w:szCs w:val="16"/>
+          <w:lang w:val="pt-BR"/>
+        </w:rPr>
+      </w:pPr>
+    </w:p>
+    <w:p>
+      <w:pPr>
+        <w:tabs>
+          <w:tab w:val="left" w:pos="328"/>
+        </w:tabs>
+        <w:spacing w:before="40"/>
+        <w:rPr>
+          <w:sz w:val="16"/>
+          <w:szCs w:val="16"/>
+          <w:lang w:val="pt-BR"/>
+        </w:rPr>
+      </w:pPr>
+      <w:r>
+        <w:rPr>
+          <w:sz w:val="16"/>
+          <w:szCs w:val="16"/>
+          <w:lang w:val="pt-BR"/>
+        </w:rPr>
+        <w:t xml:space="preserve">    </w:t>
+      </w:r>
+      <w:proofErr w:type="spellStart"/>
+      <w:proofErr w:type="gramStart"/>
+      <w:r>
+        <w:rPr>
+          <w:sz w:val="16"/>
+          <w:szCs w:val="16"/>
+          <w:lang w:val="pt-BR"/>
+        </w:rPr>
+        <w:t>printf</w:t>
+      </w:r>
+      <w:proofErr w:type="spellEnd"/>
+      <w:r>
+        <w:rPr>
+          <w:sz w:val="16"/>
+          <w:szCs w:val="16"/>
+          <w:lang w:val="pt-BR"/>
+        </w:rPr>
+        <w:t>(</w:t>
+      </w:r>
+      <w:proofErr w:type="gramEnd"/>
+      <w:r>
+        <w:rPr>
+          <w:sz w:val="16"/>
+          <w:szCs w:val="16"/>
+          <w:lang w:val="pt-BR"/>
+        </w:rPr>
+        <w:t>"Digite a segunda nota ");</w:t>
+      </w:r>
+    </w:p>
+    <w:p>
+      <w:pPr>
+        <w:tabs>
+          <w:tab w:val="left" w:pos="328"/>
+        </w:tabs>
+        <w:spacing w:before="40"/>
+        <w:rPr>
+          <w:sz w:val="16"/>
+          <w:szCs w:val="16"/>
+          <w:lang w:val="pt-BR"/>
+        </w:rPr>
+      </w:pPr>
+      <w:r>
+        <w:rPr>
+          <w:sz w:val="16"/>
+          <w:szCs w:val="16"/>
+          <w:lang w:val="pt-BR"/>
+        </w:rPr>
+        <w:t xml:space="preserve">    </w:t>
+      </w:r>
+      <w:proofErr w:type="spellStart"/>
+      <w:proofErr w:type="gramStart"/>
+      <w:r>
+        <w:rPr>
+          <w:sz w:val="16"/>
+          <w:szCs w:val="16"/>
+          <w:lang w:val="pt-BR"/>
+        </w:rPr>
+        <w:t>scanf</w:t>
+      </w:r>
+      <w:proofErr w:type="spellEnd"/>
+      <w:r>
+        <w:rPr>
+          <w:sz w:val="16"/>
+          <w:szCs w:val="16"/>
+          <w:lang w:val="pt-BR"/>
+        </w:rPr>
+        <w:t>(</w:t>
+      </w:r>
+      <w:proofErr w:type="gramEnd"/>
+      <w:r>
+        <w:rPr>
+          <w:sz w:val="16"/>
+          <w:szCs w:val="16"/>
+          <w:lang w:val="pt-BR"/>
+        </w:rPr>
+        <w:t>"%d", &amp;b);</w:t>
+      </w:r>
+    </w:p>
+    <w:p>
+      <w:pPr>
+        <w:tabs>
+          <w:tab w:val="left" w:pos="328"/>
+        </w:tabs>
+        <w:spacing w:before="40"/>
+        <w:rPr>
+          <w:sz w:val="16"/>
+          <w:szCs w:val="16"/>
+          <w:lang w:val="pt-BR"/>
+        </w:rPr>
+      </w:pPr>
+    </w:p>
+    <w:p>
+      <w:pPr>
+        <w:tabs>
+          <w:tab w:val="left" w:pos="328"/>
+        </w:tabs>
+        <w:spacing w:before="40"/>
+        <w:rPr>
+          <w:sz w:val="16"/>
+          <w:szCs w:val="16"/>
+          <w:lang w:val="pt-BR"/>
+        </w:rPr>
+      </w:pPr>
+      <w:r>
+        <w:rPr>
+          <w:sz w:val="16"/>
+          <w:szCs w:val="16"/>
+          <w:lang w:val="pt-BR"/>
+        </w:rPr>
+        <w:t xml:space="preserve">    </w:t>
+      </w:r>
+      <w:proofErr w:type="spellStart"/>
+      <w:proofErr w:type="gramStart"/>
+      <w:r>
+        <w:rPr>
+          <w:sz w:val="16"/>
+          <w:szCs w:val="16"/>
+          <w:lang w:val="pt-BR"/>
+        </w:rPr>
+        <w:t>printf</w:t>
+      </w:r>
+      <w:proofErr w:type="spellEnd"/>
+      <w:r>
+        <w:rPr>
+          <w:sz w:val="16"/>
+          <w:szCs w:val="16"/>
+          <w:lang w:val="pt-BR"/>
+        </w:rPr>
+        <w:t>(</w:t>
+      </w:r>
+      <w:proofErr w:type="gramEnd"/>
+      <w:r>
+        <w:rPr>
+          <w:sz w:val="16"/>
+          <w:szCs w:val="16"/>
+          <w:lang w:val="pt-BR"/>
+        </w:rPr>
+        <w:t>"Digite a terceira nota ");</w:t>
+      </w:r>
+    </w:p>
+    <w:p>
+      <w:pPr>
+        <w:tabs>
+          <w:tab w:val="left" w:pos="328"/>
+        </w:tabs>
+        <w:spacing w:before="40"/>
+        <w:rPr>
+          <w:sz w:val="16"/>
+          <w:szCs w:val="16"/>
+          <w:lang w:val="pt-BR"/>
+        </w:rPr>
+      </w:pPr>
+      <w:r>
+        <w:rPr>
+          <w:sz w:val="16"/>
+          <w:szCs w:val="16"/>
+          <w:lang w:val="pt-BR"/>
+        </w:rPr>
+        <w:t xml:space="preserve">    </w:t>
+      </w:r>
+      <w:proofErr w:type="spellStart"/>
+      <w:proofErr w:type="gramStart"/>
+      <w:r>
+        <w:rPr>
+          <w:sz w:val="16"/>
+          <w:szCs w:val="16"/>
+          <w:lang w:val="pt-BR"/>
+        </w:rPr>
+        <w:t>scanf</w:t>
+      </w:r>
+      <w:proofErr w:type="spellEnd"/>
+      <w:r>
+        <w:rPr>
+          <w:sz w:val="16"/>
+          <w:szCs w:val="16"/>
+          <w:lang w:val="pt-BR"/>
+        </w:rPr>
+        <w:t>(</w:t>
+      </w:r>
+      <w:proofErr w:type="gramEnd"/>
+      <w:r>
+        <w:rPr>
+          <w:sz w:val="16"/>
+          <w:szCs w:val="16"/>
+          <w:lang w:val="pt-BR"/>
+        </w:rPr>
+        <w:t>"%d", &amp;c);</w:t>
+      </w:r>
+    </w:p>
+    <w:p>
+      <w:pPr>
+        <w:tabs>
+          <w:tab w:val="left" w:pos="328"/>
+        </w:tabs>
+        <w:spacing w:before="40"/>
+        <w:rPr>
+          <w:sz w:val="16"/>
+          <w:szCs w:val="16"/>
+          <w:lang w:val="pt-BR"/>
+        </w:rPr>
+      </w:pPr>
+    </w:p>
+    <w:p>
+      <w:pPr>
+        <w:tabs>
+          <w:tab w:val="left" w:pos="328"/>
+        </w:tabs>
+        <w:spacing w:before="40"/>
+        <w:rPr>
+          <w:sz w:val="16"/>
+          <w:szCs w:val="16"/>
+          <w:lang w:val="pt-BR"/>
+        </w:rPr>
+      </w:pPr>
+      <w:r>
+        <w:rPr>
+          <w:sz w:val="16"/>
+          <w:szCs w:val="16"/>
+          <w:lang w:val="pt-BR"/>
+        </w:rPr>
+        <w:t xml:space="preserve">    media = </w:t>
+      </w:r>
+      <w:proofErr w:type="spellStart"/>
+      <w:proofErr w:type="gramStart"/>
+      <w:r>
+        <w:rPr>
+          <w:sz w:val="16"/>
+          <w:szCs w:val="16"/>
+          <w:lang w:val="pt-BR"/>
+        </w:rPr>
+        <w:t>calculaMedia</w:t>
+      </w:r>
+      <w:proofErr w:type="spellEnd"/>
+      <w:r>
+        <w:rPr>
+          <w:sz w:val="16"/>
+          <w:szCs w:val="16"/>
+          <w:lang w:val="pt-BR"/>
+        </w:rPr>
+        <w:t>(</w:t>
+      </w:r>
+      <w:proofErr w:type="gramEnd"/>
+      <w:r>
+        <w:rPr>
+          <w:sz w:val="16"/>
+          <w:szCs w:val="16"/>
+          <w:lang w:val="pt-BR"/>
+        </w:rPr>
+        <w:t>a, b, c);</w:t>
+      </w:r>
+    </w:p>
+    <w:p>
+      <w:pPr>
+        <w:tabs>
+          <w:tab w:val="left" w:pos="328"/>
+        </w:tabs>
+        <w:spacing w:before="40"/>
+        <w:rPr>
+          <w:sz w:val="16"/>
+          <w:szCs w:val="16"/>
+          <w:lang w:val="pt-BR"/>
+        </w:rPr>
+      </w:pPr>
+    </w:p>
+    <w:p>
+      <w:pPr>
+        <w:tabs>
+          <w:tab w:val="left" w:pos="328"/>
+        </w:tabs>
+        <w:spacing w:before="40"/>
+        <w:rPr>
+          <w:sz w:val="16"/>
+          <w:szCs w:val="16"/>
+          <w:lang w:val="pt-BR"/>
+        </w:rPr>
+      </w:pPr>
+      <w:r>
+        <w:rPr>
+          <w:sz w:val="16"/>
+          <w:szCs w:val="16"/>
+          <w:lang w:val="pt-BR"/>
+        </w:rPr>
+        <w:t xml:space="preserve">    </w:t>
+      </w:r>
+      <w:proofErr w:type="spellStart"/>
+      <w:proofErr w:type="gramStart"/>
+      <w:r>
+        <w:rPr>
+          <w:sz w:val="16"/>
+          <w:szCs w:val="16"/>
+          <w:lang w:val="pt-BR"/>
+        </w:rPr>
+        <w:t>printf</w:t>
+      </w:r>
+      <w:proofErr w:type="spellEnd"/>
+      <w:r>
+        <w:rPr>
+          <w:sz w:val="16"/>
+          <w:szCs w:val="16"/>
+          <w:lang w:val="pt-BR"/>
+        </w:rPr>
+        <w:t>(</w:t>
+      </w:r>
+      <w:proofErr w:type="gramEnd"/>
+      <w:r>
+        <w:rPr>
+          <w:sz w:val="16"/>
+          <w:szCs w:val="16"/>
+          <w:lang w:val="pt-BR"/>
+        </w:rPr>
+        <w:t>"\n AGORA VAMOS SABER SE O ALUNO ESTA APROVADO, REPROVADO OU EM RECUPERACAO !!! \n\n");</w:t>
+      </w:r>
+    </w:p>
+    <w:p>
+      <w:pPr>
+        <w:tabs>
+          <w:tab w:val="left" w:pos="328"/>
+        </w:tabs>
+        <w:spacing w:before="40"/>
+        <w:rPr>
+          <w:sz w:val="16"/>
+          <w:szCs w:val="16"/>
+          <w:lang w:val="pt-BR"/>
+        </w:rPr>
+      </w:pPr>
+    </w:p>
+    <w:p>
+      <w:pPr>
+        <w:tabs>
+          <w:tab w:val="left" w:pos="328"/>
+        </w:tabs>
+        <w:spacing w:before="40"/>
+        <w:rPr>
+          <w:sz w:val="16"/>
+          <w:szCs w:val="16"/>
+          <w:lang w:val="pt-BR"/>
+        </w:rPr>
+      </w:pPr>
+      <w:r>
+        <w:rPr>
+          <w:sz w:val="16"/>
+          <w:szCs w:val="16"/>
+          <w:lang w:val="pt-BR"/>
+        </w:rPr>
+        <w:t xml:space="preserve">    resultado = </w:t>
+      </w:r>
+      <w:proofErr w:type="spellStart"/>
+      <w:r>
+        <w:rPr>
+          <w:sz w:val="16"/>
+          <w:szCs w:val="16"/>
+          <w:lang w:val="pt-BR"/>
+        </w:rPr>
+        <w:t>exibirResultado</w:t>
+      </w:r>
+      <w:proofErr w:type="spellEnd"/>
+      <w:r>
+        <w:rPr>
+          <w:sz w:val="16"/>
+          <w:szCs w:val="16"/>
+          <w:lang w:val="pt-BR"/>
+        </w:rPr>
+        <w:t>(media);</w:t>
+      </w:r>
+    </w:p>
+    <w:p>
+      <w:pPr>
+        <w:tabs>
+          <w:tab w:val="left" w:pos="328"/>
+        </w:tabs>
+        <w:spacing w:before="40"/>
+        <w:rPr>
+          <w:sz w:val="16"/>
+          <w:szCs w:val="16"/>
+          <w:lang w:val="pt-BR"/>
+        </w:rPr>
+      </w:pPr>
+    </w:p>
+    <w:p>
+      <w:pPr>
+        <w:tabs>
+          <w:tab w:val="left" w:pos="328"/>
+        </w:tabs>
+        <w:spacing w:before="40"/>
+        <w:rPr>
+          <w:sz w:val="16"/>
+          <w:szCs w:val="16"/>
+          <w:lang w:val="pt-BR"/>
+        </w:rPr>
+      </w:pPr>
+      <w:r>
+        <w:rPr>
+          <w:sz w:val="16"/>
+          <w:szCs w:val="16"/>
+          <w:lang w:val="pt-BR"/>
+        </w:rPr>
+        <w:t xml:space="preserve">    </w:t>
+      </w:r>
+      <w:proofErr w:type="spellStart"/>
+      <w:r>
+        <w:rPr>
+          <w:sz w:val="16"/>
+          <w:szCs w:val="16"/>
+          <w:lang w:val="pt-BR"/>
+        </w:rPr>
+        <w:t>printf</w:t>
+      </w:r>
+      <w:proofErr w:type="spellEnd"/>
+      <w:r>
+        <w:rPr>
+          <w:sz w:val="16"/>
+          <w:szCs w:val="16"/>
+          <w:lang w:val="pt-BR"/>
+        </w:rPr>
+        <w:t>(resultado);</w:t>
+      </w:r>
+    </w:p>
+    <w:p>
+      <w:pPr>
+        <w:tabs>
+          <w:tab w:val="left" w:pos="328"/>
+        </w:tabs>
+        <w:spacing w:before="40"/>
+        <w:rPr>
+          <w:sz w:val="16"/>
+          <w:szCs w:val="16"/>
+          <w:lang w:val="pt-BR"/>
+        </w:rPr>
+      </w:pPr>
+    </w:p>
+    <w:p>
+      <w:pPr>
+        <w:tabs>
+          <w:tab w:val="left" w:pos="328"/>
+        </w:tabs>
+        <w:spacing w:before="40"/>
+        <w:rPr>
+          <w:sz w:val="16"/>
+          <w:szCs w:val="16"/>
+          <w:lang w:val="pt-BR"/>
+        </w:rPr>
+      </w:pPr>
+      <w:r>
+        <w:rPr>
+          <w:sz w:val="16"/>
+          <w:szCs w:val="16"/>
+          <w:lang w:val="pt-BR"/>
+        </w:rPr>
+        <w:t>}</w:t>
       </w:r>
     </w:p>
     <w:p>

</xml_diff>